<commit_message>
Add prologue chapter and story assets
Implement the story prologue and related changes: add a full chapter1 narrative in Story::chapter1, update Story::play_chapter to call the new chapter, and adjust the Story API (rename Chapter1 enum value to TheAcademy and change chapter1 signature). Persist game state after playing a chapter by calling save_game in main. Update default save values (hp, mana, story chapter) in saves/save.json. Add/move multiple story assets and images under Story/images/Icon and Story/images/Story_Images, add Story docx files, and remove obsolete json gif files. Also include a small menu formatting fix in Menu.cpp.
</commit_message>
<xml_diff>
--- a/Story/Story.docx
+++ b/Story/Story.docx
@@ -4,17 +4,20 @@
   <w:body>
     <w:p>
       <w:r>
+        <w:rPr>
+          <w:noProof/>
+        </w:rPr>
         <w:drawing>
-          <wp:anchor distT="0" distB="0" distL="114300" distR="114300" simplePos="0" relativeHeight="251658240" behindDoc="1" locked="0" layoutInCell="1" allowOverlap="1" wp14:anchorId="75146F98" wp14:editId="7EA9ADF3">
+          <wp:anchor distT="0" distB="0" distL="114300" distR="114300" simplePos="0" relativeHeight="251658240" behindDoc="1" locked="0" layoutInCell="1" allowOverlap="1" wp14:anchorId="75146F98" wp14:editId="75FE96EE">
             <wp:simplePos x="0" y="0"/>
             <wp:positionH relativeFrom="column">
-              <wp:posOffset>-1066442</wp:posOffset>
+              <wp:posOffset>-1123950</wp:posOffset>
             </wp:positionH>
             <wp:positionV relativeFrom="page">
-              <wp:posOffset>16939</wp:posOffset>
+              <wp:posOffset>-96274</wp:posOffset>
             </wp:positionV>
-            <wp:extent cx="7649845" cy="10716895"/>
-            <wp:effectExtent l="0" t="0" r="0" b="1905"/>
+            <wp:extent cx="7711392" cy="10803118"/>
+            <wp:effectExtent l="0" t="0" r="0" b="5080"/>
             <wp:wrapNone/>
             <wp:docPr id="412014667" name="Imagem 1"/>
             <wp:cNvGraphicFramePr>
@@ -28,7 +31,7 @@
                     <pic:cNvPicPr/>
                   </pic:nvPicPr>
                   <pic:blipFill>
-                    <a:blip r:embed="rId6"/>
+                    <a:blip r:embed="rId8"/>
                     <a:stretch>
                       <a:fillRect/>
                     </a:stretch>
@@ -36,7 +39,7 @@
                   <pic:spPr>
                     <a:xfrm>
                       <a:off x="0" y="0"/>
-                      <a:ext cx="7649845" cy="10716895"/>
+                      <a:ext cx="7711392" cy="10803118"/>
                     </a:xfrm>
                     <a:prstGeom prst="rect">
                       <a:avLst/>
@@ -55,20 +58,1666 @@
         </w:drawing>
       </w:r>
     </w:p>
+    <w:p>
+      <w:pPr>
+        <w:jc w:val="left"/>
+      </w:pPr>
+    </w:p>
+    <w:p/>
+    <w:p>
+      <w:pPr>
+        <w:jc w:val="left"/>
+        <w:rPr>
+          <w:rFonts w:eastAsiaTheme="majorEastAsia" w:cstheme="majorBidi"/>
+          <w:b/>
+          <w:bCs/>
+          <w:color w:val="000000" w:themeColor="text1"/>
+          <w:sz w:val="40"/>
+          <w:szCs w:val="40"/>
+        </w:rPr>
+      </w:pPr>
+      <w:r>
+        <w:br w:type="page"/>
+      </w:r>
+    </w:p>
+    <w:sdt>
+      <w:sdtPr>
+        <w:rPr>
+          <w:rFonts w:ascii="Source Sans Pro" w:eastAsiaTheme="minorHAnsi" w:hAnsi="Source Sans Pro" w:cstheme="minorBidi"/>
+          <w:b w:val="0"/>
+          <w:bCs w:val="0"/>
+          <w:color w:val="auto"/>
+          <w:kern w:val="2"/>
+          <w:sz w:val="24"/>
+          <w:szCs w:val="24"/>
+          <w:lang w:val="en-US" w:eastAsia="en-US"/>
+          <w14:ligatures w14:val="standardContextual"/>
+        </w:rPr>
+        <w:id w:val="-1777555161"/>
+        <w:docPartObj>
+          <w:docPartGallery w:val="Table of Contents"/>
+          <w:docPartUnique/>
+        </w:docPartObj>
+      </w:sdtPr>
+      <w:sdtEndPr>
+        <w:rPr>
+          <w:noProof/>
+        </w:rPr>
+      </w:sdtEndPr>
+      <w:sdtContent>
+        <w:p>
+          <w:pPr>
+            <w:pStyle w:val="Cabealhodondice"/>
+          </w:pPr>
+          <w:r>
+            <w:t>Índex</w:t>
+          </w:r>
+        </w:p>
+        <w:p>
+          <w:pPr>
+            <w:pStyle w:val="ndice1"/>
+            <w:tabs>
+              <w:tab w:val="right" w:leader="dot" w:pos="8494"/>
+            </w:tabs>
+            <w:rPr>
+              <w:rFonts w:eastAsiaTheme="minorEastAsia"/>
+              <w:b w:val="0"/>
+              <w:bCs w:val="0"/>
+              <w:i w:val="0"/>
+              <w:iCs w:val="0"/>
+              <w:noProof/>
+              <w:lang w:val="pt-PT" w:eastAsia="pt-PT"/>
+            </w:rPr>
+          </w:pPr>
+          <w:r>
+            <w:rPr>
+              <w:b w:val="0"/>
+              <w:bCs w:val="0"/>
+            </w:rPr>
+            <w:fldChar w:fldCharType="begin"/>
+          </w:r>
+          <w:r>
+            <w:instrText>TOC \o "1-3" \h \z \u</w:instrText>
+          </w:r>
+          <w:r>
+            <w:rPr>
+              <w:b w:val="0"/>
+              <w:bCs w:val="0"/>
+            </w:rPr>
+            <w:fldChar w:fldCharType="separate"/>
+          </w:r>
+          <w:hyperlink w:anchor="_Toc224345057" w:history="1">
+            <w:r>
+              <w:rPr>
+                <w:rStyle w:val="Hiperligao"/>
+                <w:noProof/>
+              </w:rPr>
+              <w:t>Canon Notes</w:t>
+            </w:r>
+            <w:r>
+              <w:rPr>
+                <w:noProof/>
+                <w:webHidden/>
+              </w:rPr>
+              <w:tab/>
+            </w:r>
+            <w:r>
+              <w:rPr>
+                <w:noProof/>
+                <w:webHidden/>
+              </w:rPr>
+              <w:fldChar w:fldCharType="begin"/>
+            </w:r>
+            <w:r>
+              <w:rPr>
+                <w:noProof/>
+                <w:webHidden/>
+              </w:rPr>
+              <w:instrText xml:space="preserve"> PAGEREF _Toc224345057 \h </w:instrText>
+            </w:r>
+            <w:r>
+              <w:rPr>
+                <w:noProof/>
+                <w:webHidden/>
+              </w:rPr>
+            </w:r>
+            <w:r>
+              <w:rPr>
+                <w:noProof/>
+                <w:webHidden/>
+              </w:rPr>
+              <w:fldChar w:fldCharType="separate"/>
+            </w:r>
+            <w:r>
+              <w:rPr>
+                <w:noProof/>
+                <w:webHidden/>
+              </w:rPr>
+              <w:t>3</w:t>
+            </w:r>
+            <w:r>
+              <w:rPr>
+                <w:noProof/>
+                <w:webHidden/>
+              </w:rPr>
+              <w:fldChar w:fldCharType="end"/>
+            </w:r>
+          </w:hyperlink>
+        </w:p>
+        <w:p>
+          <w:pPr>
+            <w:pStyle w:val="ndice1"/>
+            <w:tabs>
+              <w:tab w:val="right" w:leader="dot" w:pos="8494"/>
+            </w:tabs>
+            <w:rPr>
+              <w:rFonts w:eastAsiaTheme="minorEastAsia"/>
+              <w:b w:val="0"/>
+              <w:bCs w:val="0"/>
+              <w:i w:val="0"/>
+              <w:iCs w:val="0"/>
+              <w:noProof/>
+              <w:lang w:val="pt-PT" w:eastAsia="pt-PT"/>
+            </w:rPr>
+          </w:pPr>
+          <w:hyperlink w:anchor="_Toc224345058" w:history="1">
+            <w:r>
+              <w:rPr>
+                <w:rStyle w:val="Hiperligao"/>
+                <w:noProof/>
+              </w:rPr>
+              <w:t>Chapter 1: Prologue</w:t>
+            </w:r>
+            <w:r>
+              <w:rPr>
+                <w:noProof/>
+                <w:webHidden/>
+              </w:rPr>
+              <w:tab/>
+            </w:r>
+            <w:r>
+              <w:rPr>
+                <w:noProof/>
+                <w:webHidden/>
+              </w:rPr>
+              <w:fldChar w:fldCharType="begin"/>
+            </w:r>
+            <w:r>
+              <w:rPr>
+                <w:noProof/>
+                <w:webHidden/>
+              </w:rPr>
+              <w:instrText xml:space="preserve"> PAGEREF _Toc224345058 \h </w:instrText>
+            </w:r>
+            <w:r>
+              <w:rPr>
+                <w:noProof/>
+                <w:webHidden/>
+              </w:rPr>
+            </w:r>
+            <w:r>
+              <w:rPr>
+                <w:noProof/>
+                <w:webHidden/>
+              </w:rPr>
+              <w:fldChar w:fldCharType="separate"/>
+            </w:r>
+            <w:r>
+              <w:rPr>
+                <w:noProof/>
+                <w:webHidden/>
+              </w:rPr>
+              <w:t>4</w:t>
+            </w:r>
+            <w:r>
+              <w:rPr>
+                <w:noProof/>
+                <w:webHidden/>
+              </w:rPr>
+              <w:fldChar w:fldCharType="end"/>
+            </w:r>
+          </w:hyperlink>
+        </w:p>
+        <w:p>
+          <w:pPr>
+            <w:pStyle w:val="ndice1"/>
+            <w:tabs>
+              <w:tab w:val="right" w:leader="dot" w:pos="8494"/>
+            </w:tabs>
+            <w:rPr>
+              <w:rFonts w:eastAsiaTheme="minorEastAsia"/>
+              <w:b w:val="0"/>
+              <w:bCs w:val="0"/>
+              <w:i w:val="0"/>
+              <w:iCs w:val="0"/>
+              <w:noProof/>
+              <w:lang w:val="pt-PT" w:eastAsia="pt-PT"/>
+            </w:rPr>
+          </w:pPr>
+          <w:hyperlink w:anchor="_Toc224345059" w:history="1">
+            <w:r>
+              <w:rPr>
+                <w:rStyle w:val="Hiperligao"/>
+                <w:noProof/>
+              </w:rPr>
+              <w:t>Chapter2: The Academy</w:t>
+            </w:r>
+            <w:r>
+              <w:rPr>
+                <w:noProof/>
+                <w:webHidden/>
+              </w:rPr>
+              <w:tab/>
+            </w:r>
+            <w:r>
+              <w:rPr>
+                <w:noProof/>
+                <w:webHidden/>
+              </w:rPr>
+              <w:fldChar w:fldCharType="begin"/>
+            </w:r>
+            <w:r>
+              <w:rPr>
+                <w:noProof/>
+                <w:webHidden/>
+              </w:rPr>
+              <w:instrText xml:space="preserve"> PAGEREF _Toc224345059 \h </w:instrText>
+            </w:r>
+            <w:r>
+              <w:rPr>
+                <w:noProof/>
+                <w:webHidden/>
+              </w:rPr>
+            </w:r>
+            <w:r>
+              <w:rPr>
+                <w:noProof/>
+                <w:webHidden/>
+              </w:rPr>
+              <w:fldChar w:fldCharType="separate"/>
+            </w:r>
+            <w:r>
+              <w:rPr>
+                <w:noProof/>
+                <w:webHidden/>
+              </w:rPr>
+              <w:t>5</w:t>
+            </w:r>
+            <w:r>
+              <w:rPr>
+                <w:noProof/>
+                <w:webHidden/>
+              </w:rPr>
+              <w:fldChar w:fldCharType="end"/>
+            </w:r>
+          </w:hyperlink>
+        </w:p>
+        <w:p>
+          <w:r>
+            <w:rPr>
+              <w:b/>
+              <w:bCs/>
+              <w:noProof/>
+            </w:rPr>
+            <w:fldChar w:fldCharType="end"/>
+          </w:r>
+        </w:p>
+      </w:sdtContent>
+    </w:sdt>
+    <w:p/>
+    <w:p>
+      <w:pPr>
+        <w:jc w:val="left"/>
+        <w:rPr>
+          <w:rFonts w:eastAsiaTheme="majorEastAsia" w:cstheme="majorBidi"/>
+          <w:b/>
+          <w:bCs/>
+          <w:color w:val="000000" w:themeColor="text1"/>
+          <w:sz w:val="40"/>
+          <w:szCs w:val="40"/>
+        </w:rPr>
+      </w:pPr>
+      <w:r>
+        <w:br w:type="page"/>
+      </w:r>
+    </w:p>
+    <w:p>
+      <w:pPr>
+        <w:pStyle w:val="Ttulo1"/>
+      </w:pPr>
+      <w:bookmarkStart w:id="0" w:name="_Toc224345057"/>
+      <w:r>
+        <w:lastRenderedPageBreak/>
+        <w:t>Canon Notes</w:t>
+      </w:r>
+      <w:bookmarkEnd w:id="0"/>
+    </w:p>
+    <w:p>
+      <w:r>
+        <w:t xml:space="preserve">This </w:t>
+      </w:r>
+      <w:r>
+        <w:t>section</w:t>
+      </w:r>
+      <w:r>
+        <w:t xml:space="preserve"> serves as the Writer’s Notes and context </w:t>
+      </w:r>
+      <w:r>
+        <w:t>between the Game and this book-like approach to the story.</w:t>
+      </w:r>
+    </w:p>
+    <w:p>
+      <w:pPr>
+        <w:rPr>
+          <w:color w:val="000000" w:themeColor="text1"/>
+        </w:rPr>
+      </w:pPr>
+      <w:r>
+        <w:rPr>
+          <w:b/>
+          <w:bCs/>
+          <w:color w:val="A02B93" w:themeColor="accent5"/>
+        </w:rPr>
+        <w:t xml:space="preserve">Lucas </w:t>
+      </w:r>
+      <w:r>
+        <w:rPr>
+          <w:color w:val="000000" w:themeColor="text1"/>
+        </w:rPr>
+        <w:t xml:space="preserve">is the Canon name of the protagonist of the Story, the </w:t>
+      </w:r>
+      <w:r>
+        <w:rPr>
+          <w:i/>
+          <w:iCs/>
+          <w:color w:val="000000" w:themeColor="text1"/>
+        </w:rPr>
+        <w:t>main character</w:t>
+      </w:r>
+      <w:r>
+        <w:rPr>
+          <w:color w:val="000000" w:themeColor="text1"/>
+        </w:rPr>
+        <w:t xml:space="preserve"> of the game</w:t>
+      </w:r>
+      <w:r>
+        <w:rPr>
+          <w:color w:val="000000" w:themeColor="text1"/>
+        </w:rPr>
+        <w:t>. When playing the game, the player can choose to be a boy or a girl and choose his/her name.</w:t>
+      </w:r>
+    </w:p>
+    <w:p>
+      <w:pPr>
+        <w:rPr>
+          <w:color w:val="000000" w:themeColor="text1"/>
+        </w:rPr>
+      </w:pPr>
+      <w:r>
+        <w:rPr>
+          <w:color w:val="000000" w:themeColor="text1"/>
+        </w:rPr>
+        <w:t xml:space="preserve">The Story is dependent on the </w:t>
+      </w:r>
+      <w:r>
+        <w:rPr>
+          <w:b/>
+          <w:bCs/>
+          <w:color w:val="4EA72E" w:themeColor="accent6"/>
+        </w:rPr>
+        <w:t>player’s choices</w:t>
+      </w:r>
+      <w:r>
+        <w:rPr>
+          <w:color w:val="4EA72E" w:themeColor="accent6"/>
+        </w:rPr>
+        <w:t xml:space="preserve"> </w:t>
+      </w:r>
+      <w:r>
+        <w:rPr>
+          <w:color w:val="000000" w:themeColor="text1"/>
+        </w:rPr>
+        <w:t>so in this version when a path deciding choice appears you will have a Hyperlinks to skip to the path.</w:t>
+      </w:r>
+    </w:p>
     <w:p/>
     <w:p/>
     <w:p/>
+    <w:p>
+      <w:pPr>
+        <w:jc w:val="left"/>
+      </w:pPr>
+      <w:r>
+        <w:br w:type="page"/>
+      </w:r>
+    </w:p>
+    <w:p>
+      <w:pPr>
+        <w:pStyle w:val="Ttulo1"/>
+      </w:pPr>
+      <w:bookmarkStart w:id="1" w:name="_Toc224345058"/>
+      <w:r>
+        <w:lastRenderedPageBreak/>
+        <w:t>Chapter 1: Prologue</w:t>
+      </w:r>
+      <w:bookmarkEnd w:id="1"/>
+    </w:p>
+    <w:p>
+      <w:pPr>
+        <w:pStyle w:val="Ttulo1"/>
+        <w:rPr>
+          <w:sz w:val="24"/>
+          <w:szCs w:val="24"/>
+        </w:rPr>
+      </w:pPr>
+    </w:p>
+    <w:p>
+      <w:r>
+        <w:t xml:space="preserve">It’s a bright morning in the </w:t>
+      </w:r>
+      <w:r>
+        <w:rPr>
+          <w:rStyle w:val="LocalCarter"/>
+        </w:rPr>
+        <w:t>Tearoma Region</w:t>
+      </w:r>
+      <w:r>
+        <w:t xml:space="preserve">. Everyone in </w:t>
+      </w:r>
+      <w:r>
+        <w:rPr>
+          <w:rStyle w:val="LocalCarter"/>
+        </w:rPr>
+        <w:t>Pinewood Town</w:t>
+      </w:r>
+      <w:r>
+        <w:t xml:space="preserve"> is still sleeping. The birds sing as the sun rises, just like any other day. Except it isn’t just another day, at least not for </w:t>
+      </w:r>
+      <w:r>
+        <w:rPr>
+          <w:rStyle w:val="NomesCarter"/>
+        </w:rPr>
+        <w:t>Lucas</w:t>
+      </w:r>
+      <w:r>
+        <w:t xml:space="preserve">, who is starting the </w:t>
+      </w:r>
+      <w:r>
+        <w:rPr>
+          <w:b/>
+          <w:bCs/>
+        </w:rPr>
+        <w:t>A</w:t>
+      </w:r>
+      <w:r>
+        <w:rPr>
+          <w:b/>
+          <w:bCs/>
+        </w:rPr>
+        <w:t>cademy</w:t>
+      </w:r>
+      <w:r>
+        <w:t xml:space="preserve"> today.</w:t>
+      </w:r>
+    </w:p>
     <w:p/>
     <w:p>
       <w:r>
+        <w:t xml:space="preserve">The </w:t>
+      </w:r>
+      <w:r>
+        <w:rPr>
+          <w:rStyle w:val="LocalCarter"/>
+        </w:rPr>
+        <w:t xml:space="preserve">Tearoma Region </w:t>
+      </w:r>
+      <w:r>
+        <w:t xml:space="preserve">is vast and diverse, filled with landscapes that range from </w:t>
+      </w:r>
+      <w:r>
+        <w:rPr>
+          <w:b/>
+          <w:bCs/>
+          <w:color w:val="0F9ED5" w:themeColor="accent4"/>
+        </w:rPr>
+        <w:t>frozen peaks</w:t>
+      </w:r>
+      <w:r>
+        <w:t xml:space="preserve"> to </w:t>
+      </w:r>
+      <w:r>
+        <w:rPr>
+          <w:b/>
+          <w:bCs/>
+          <w:color w:val="4EA72E" w:themeColor="accent6"/>
+        </w:rPr>
+        <w:t>untamed wilderness</w:t>
+      </w:r>
+      <w:r>
+        <w:t>. It is also home to many creatures</w:t>
+      </w:r>
+      <w:r>
+        <w:t xml:space="preserve">; </w:t>
+      </w:r>
+      <w:r>
+        <w:t>some so rare and mysterious that, where we come from, they exist only in myths and old stories.</w:t>
+      </w:r>
+      <w:r>
+        <w:t xml:space="preserve"> The region is divided in three areas:</w:t>
+      </w:r>
+    </w:p>
+    <w:p/>
+    <w:p>
+      <w:pPr>
+        <w:pStyle w:val="PargrafodaLista"/>
+        <w:numPr>
+          <w:ilvl w:val="0"/>
+          <w:numId w:val="5"/>
+        </w:numPr>
+      </w:pPr>
+      <w:r>
+        <w:rPr>
+          <w:rStyle w:val="LocalCarter"/>
+        </w:rPr>
+        <w:t>The Frozen Mountains</w:t>
+      </w:r>
+      <w:r>
+        <w:rPr>
+          <w:color w:val="0F9ED5" w:themeColor="accent4"/>
+        </w:rPr>
+        <w:t xml:space="preserve"> </w:t>
+      </w:r>
+      <w:r>
+        <w:t xml:space="preserve">– Controlled by the </w:t>
+      </w:r>
+      <w:r>
+        <w:rPr>
+          <w:rStyle w:val="ClansCarter"/>
+        </w:rPr>
+        <w:t>Wolves of the North</w:t>
+      </w:r>
+      <w:r>
+        <w:t>, a guild that focuses on protecting the region.</w:t>
+      </w:r>
+    </w:p>
+    <w:p/>
+    <w:p>
+      <w:pPr>
+        <w:pStyle w:val="PargrafodaLista"/>
+        <w:numPr>
+          <w:ilvl w:val="0"/>
+          <w:numId w:val="4"/>
+        </w:numPr>
+      </w:pPr>
+      <w:r>
+        <w:rPr>
+          <w:rStyle w:val="LocalCarter"/>
+        </w:rPr>
+        <w:t>Amestria</w:t>
+      </w:r>
+      <w:r>
+        <w:t xml:space="preserve"> – The part of the region where the capital, </w:t>
+      </w:r>
+      <w:r>
+        <w:rPr>
+          <w:rStyle w:val="LocalCarter"/>
+        </w:rPr>
+        <w:t>Shomei</w:t>
+      </w:r>
+      <w:r>
+        <w:t xml:space="preserve">, is located. This is the heart of </w:t>
+      </w:r>
+      <w:r>
+        <w:rPr>
+          <w:rStyle w:val="LocalCarter"/>
+        </w:rPr>
+        <w:t>Tearoma</w:t>
+      </w:r>
+      <w:r>
+        <w:t xml:space="preserve">, where the economy is at its strongest. Three clans dominate this area: the </w:t>
+      </w:r>
+      <w:r>
+        <w:rPr>
+          <w:rStyle w:val="ClansCarter"/>
+        </w:rPr>
+        <w:t>Raven</w:t>
+      </w:r>
+      <w:r>
+        <w:t xml:space="preserve">, the </w:t>
+      </w:r>
+      <w:r>
+        <w:rPr>
+          <w:rStyle w:val="ClansCarter"/>
+        </w:rPr>
+        <w:t>Silver</w:t>
+      </w:r>
+      <w:r>
+        <w:t xml:space="preserve">, and the </w:t>
+      </w:r>
+      <w:r>
+        <w:rPr>
+          <w:rStyle w:val="ClansCarter"/>
+        </w:rPr>
+        <w:t>Ferrari</w:t>
+      </w:r>
+      <w:r>
+        <w:t>.</w:t>
+      </w:r>
+    </w:p>
+    <w:p/>
+    <w:p>
+      <w:pPr>
+        <w:pStyle w:val="PargrafodaLista"/>
+        <w:numPr>
+          <w:ilvl w:val="0"/>
+          <w:numId w:val="3"/>
+        </w:numPr>
+        <w:rPr>
+          <w:color w:val="000000" w:themeColor="text1"/>
+        </w:rPr>
+      </w:pPr>
+      <w:r>
+        <w:rPr>
+          <w:rStyle w:val="LocalCarter"/>
+        </w:rPr>
+        <w:t>The Wilds</w:t>
+      </w:r>
+      <w:r>
+        <w:t xml:space="preserve"> – The least technologically advanced subregion of </w:t>
+      </w:r>
+      <w:r>
+        <w:rPr>
+          <w:rStyle w:val="LocalCarter"/>
+        </w:rPr>
+        <w:t>Tearoma</w:t>
+      </w:r>
+      <w:r>
+        <w:t>, filled with villages, farms, mines, and untamed land.</w:t>
+      </w:r>
+    </w:p>
+    <w:p>
+      <w:pPr>
+        <w:pStyle w:val="PargrafodaLista"/>
+        <w:rPr>
+          <w:color w:val="000000" w:themeColor="text1"/>
+        </w:rPr>
+      </w:pPr>
+    </w:p>
+    <w:p>
+      <w:r>
+        <w:rPr>
+          <w:rStyle w:val="NomesCarter"/>
+        </w:rPr>
+        <w:t>Lucas</w:t>
+      </w:r>
+      <w:r>
+        <w:t xml:space="preserve"> </w:t>
+      </w:r>
+      <w:r>
+        <w:t>doesn’t</w:t>
+      </w:r>
+      <w:r>
+        <w:t xml:space="preserve"> know it yet, but he is about to take the first step into an entire</w:t>
+      </w:r>
+      <w:r>
+        <w:t>ly</w:t>
+      </w:r>
+      <w:r>
+        <w:t xml:space="preserve"> new world!</w:t>
+      </w:r>
+    </w:p>
+    <w:p>
+      <w:r>
+        <w:rPr>
+          <w:rStyle w:val="NomesCarter"/>
+        </w:rPr>
+        <w:t>Lucas</w:t>
+      </w:r>
+      <w:r>
+        <w:t xml:space="preserve"> wakes up</w:t>
+      </w:r>
+      <w:r>
+        <w:t>.</w:t>
+      </w:r>
+      <w:r>
+        <w:t xml:space="preserve"> </w:t>
+      </w:r>
+      <w:r>
+        <w:t>T</w:t>
+      </w:r>
+      <w:r>
+        <w:t>he clock says 07:03</w:t>
+      </w:r>
+      <w:r>
+        <w:t>.</w:t>
+      </w:r>
+      <w:r>
+        <w:t xml:space="preserve"> </w:t>
+      </w:r>
+      <w:r>
+        <w:t>H</w:t>
+      </w:r>
+      <w:r>
+        <w:t xml:space="preserve">e gets up and gets ready calmly as </w:t>
+      </w:r>
+      <w:r>
+        <w:t>the Welcome ceremony</w:t>
+      </w:r>
+      <w:r>
+        <w:t xml:space="preserve"> start</w:t>
+      </w:r>
+      <w:r>
+        <w:t>s</w:t>
+      </w:r>
+      <w:r>
+        <w:t xml:space="preserve"> at </w:t>
+      </w:r>
+      <w:r>
+        <w:t>9</w:t>
+      </w:r>
+      <w:r>
+        <w:t xml:space="preserve">:30 but he couldn’t sleep with the excitement. </w:t>
+      </w:r>
+    </w:p>
+    <w:p>
+      <w:r>
+        <w:rPr>
+          <w:rStyle w:val="NomesCarter"/>
+        </w:rPr>
+        <w:t>???</w:t>
+      </w:r>
+      <w:r>
+        <w:t xml:space="preserve">: </w:t>
+      </w:r>
+      <w:r>
+        <w:t>Hey Lucas, come down for breakfast!!!</w:t>
+      </w:r>
+    </w:p>
+    <w:p>
+      <w:r>
+        <w:rPr>
+          <w:rStyle w:val="NomesCarter"/>
+        </w:rPr>
+        <w:t>Lucas</w:t>
+      </w:r>
+      <w:r>
+        <w:t>:</w:t>
+      </w:r>
+      <w:r>
+        <w:t xml:space="preserve"> Ok Mom I’m going</w:t>
+      </w:r>
+      <w:r>
+        <w:t xml:space="preserve">! – I am finally starting training in the </w:t>
+      </w:r>
+      <w:r>
+        <w:rPr>
+          <w:b/>
+          <w:bCs/>
+        </w:rPr>
+        <w:t xml:space="preserve">Academy; </w:t>
+      </w:r>
+      <w:r>
+        <w:t xml:space="preserve">I’m going to be the best </w:t>
+      </w:r>
+      <w:r>
+        <w:rPr>
+          <w:b/>
+          <w:bCs/>
+          <w:color w:val="FFC000"/>
+        </w:rPr>
+        <w:t>Knight</w:t>
+      </w:r>
+      <w:r>
+        <w:rPr>
+          <w:color w:val="FFC000"/>
+        </w:rPr>
+        <w:t xml:space="preserve"> </w:t>
+      </w:r>
+      <w:r>
+        <w:t xml:space="preserve">of all time and then I can serve as one of the </w:t>
+      </w:r>
+      <w:r>
+        <w:rPr>
+          <w:b/>
+          <w:bCs/>
+          <w:i/>
+          <w:iCs/>
+          <w:color w:val="FFC000"/>
+        </w:rPr>
+        <w:t>10 Golden Swords</w:t>
+      </w:r>
+      <w:r>
+        <w:rPr>
+          <w:color w:val="FFC000"/>
+        </w:rPr>
+        <w:t xml:space="preserve"> </w:t>
+      </w:r>
+      <w:r>
+        <w:t xml:space="preserve">with my </w:t>
+      </w:r>
+      <w:r>
+        <w:rPr>
+          <w:rStyle w:val="NomesCarter"/>
+        </w:rPr>
+        <w:t>D</w:t>
+      </w:r>
+      <w:r>
+        <w:rPr>
+          <w:rStyle w:val="NomesCarter"/>
+        </w:rPr>
+        <w:t>ad</w:t>
+      </w:r>
+      <w:r>
+        <w:t>!</w:t>
+      </w:r>
+    </w:p>
+    <w:p>
+      <w:r>
+        <w:rPr>
+          <w:rStyle w:val="NomesCarter"/>
+        </w:rPr>
+        <w:t>Thomas Orizon</w:t>
+      </w:r>
+      <w:r>
+        <w:t>,</w:t>
+      </w:r>
+      <w:r>
+        <w:rPr>
+          <w:rStyle w:val="NomesCarter"/>
+        </w:rPr>
+        <w:t xml:space="preserve"> </w:t>
+      </w:r>
+      <w:r>
+        <w:t>the first</w:t>
+      </w:r>
+      <w:r>
+        <w:t xml:space="preserve"> person from </w:t>
+      </w:r>
+      <w:r>
+        <w:rPr>
+          <w:rStyle w:val="LocalCarter"/>
+        </w:rPr>
+        <w:t>The Wilds</w:t>
+      </w:r>
+      <w:r>
+        <w:t xml:space="preserve"> to be honored by the </w:t>
+      </w:r>
+      <w:r>
+        <w:rPr>
+          <w:b/>
+          <w:bCs/>
+          <w:color w:val="FFC000"/>
+        </w:rPr>
+        <w:t>King</w:t>
+      </w:r>
+      <w:r>
+        <w:rPr>
+          <w:color w:val="FFC000"/>
+        </w:rPr>
+        <w:t xml:space="preserve"> </w:t>
+      </w:r>
+      <w:r>
+        <w:t xml:space="preserve">with the highest </w:t>
+      </w:r>
+      <w:r>
+        <w:t>honor</w:t>
+      </w:r>
+      <w:r>
+        <w:t xml:space="preserve"> a </w:t>
+      </w:r>
+      <w:r>
+        <w:rPr>
+          <w:b/>
+          <w:bCs/>
+          <w:color w:val="FFC000"/>
+        </w:rPr>
+        <w:t>Knight</w:t>
+      </w:r>
+      <w:r>
+        <w:rPr>
+          <w:color w:val="FFC000"/>
+        </w:rPr>
+        <w:t xml:space="preserve"> </w:t>
+      </w:r>
+      <w:r>
+        <w:t xml:space="preserve">can </w:t>
+      </w:r>
+      <w:r>
+        <w:t>receive,</w:t>
+      </w:r>
+      <w:r>
+        <w:t xml:space="preserve"> becoming one of the ten protectors of the </w:t>
+      </w:r>
+      <w:r>
+        <w:rPr>
+          <w:b/>
+          <w:bCs/>
+          <w:color w:val="FFC000"/>
+        </w:rPr>
+        <w:t>King</w:t>
+      </w:r>
+      <w:r>
+        <w:rPr>
+          <w:color w:val="FFC000"/>
+        </w:rPr>
+        <w:t xml:space="preserve"> </w:t>
+      </w:r>
+      <w:r>
+        <w:t>himself</w:t>
+      </w:r>
+      <w:r>
+        <w:t>.</w:t>
+      </w:r>
+    </w:p>
+    <w:p>
+      <w:r>
+        <w:rPr>
+          <w:rStyle w:val="NomesCarter"/>
+        </w:rPr>
+        <w:lastRenderedPageBreak/>
+        <w:t>Mom</w:t>
+      </w:r>
+      <w:r>
+        <w:t>: What are thinking about? You seem apprehensive.</w:t>
+      </w:r>
+    </w:p>
+    <w:p>
+      <w:r>
+        <w:rPr>
+          <w:rStyle w:val="NomesCarter"/>
+        </w:rPr>
+        <w:t>Lucas</w:t>
+      </w:r>
+      <w:r>
+        <w:t xml:space="preserve">: Oh, nothing just really excited to get started on the </w:t>
+      </w:r>
+      <w:r>
+        <w:rPr>
+          <w:b/>
+          <w:bCs/>
+        </w:rPr>
+        <w:t>Academy</w:t>
+      </w:r>
+      <w:r>
+        <w:t>; The pancakes are great Mom thanks!</w:t>
+      </w:r>
+    </w:p>
+    <w:p>
+      <w:r>
+        <w:rPr>
+          <w:rStyle w:val="NomesCarter"/>
+        </w:rPr>
+        <w:t>Mom</w:t>
+      </w:r>
+      <w:r>
+        <w:t>: Of course! Now finish getting ready so you won’t be late!</w:t>
+      </w:r>
+    </w:p>
+    <w:p>
+      <w:r>
+        <w:rPr>
+          <w:rStyle w:val="NomesCarter"/>
+        </w:rPr>
+        <w:t>Lucas</w:t>
+      </w:r>
+      <w:r>
+        <w:t>: Isn’t Dad coming to the Welcome ceremony?</w:t>
+      </w:r>
+    </w:p>
+    <w:p>
+      <w:r>
+        <w:rPr>
+          <w:rStyle w:val="NomesCarter"/>
+        </w:rPr>
+        <w:t>Mom</w:t>
+      </w:r>
+      <w:r>
+        <w:t>: Sorry sweetie there was an important mission, so he won’t be able to come.</w:t>
+      </w:r>
+    </w:p>
+    <w:p>
+      <w:r>
+        <w:rPr>
+          <w:rStyle w:val="NomesCarter"/>
+        </w:rPr>
+        <w:t>Lucas</w:t>
+      </w:r>
+      <w:r>
+        <w:t>: Really? And they couldn’t send someone else? That sucks!</w:t>
+      </w:r>
+    </w:p>
+    <w:p>
+      <w:r>
+        <w:rPr>
+          <w:rStyle w:val="NomesCarter"/>
+        </w:rPr>
+        <w:t>Mom</w:t>
+      </w:r>
+      <w:r>
+        <w:t>: I know. Come on let’s go</w:t>
+      </w:r>
+      <w:r>
+        <w:t>, if you don’t catch the train, you won’t be admitted</w:t>
+      </w:r>
+      <w:r>
+        <w:t>.</w:t>
+      </w:r>
+    </w:p>
+    <w:p>
+      <w:r>
+        <w:rPr>
+          <w:rStyle w:val="NomesCarter"/>
+        </w:rPr>
+        <w:t>Lucas</w:t>
+      </w:r>
+      <w:r>
+        <w:t xml:space="preserve">: All right! </w:t>
+      </w:r>
+      <w:r>
+        <w:t xml:space="preserve">Academy, </w:t>
+      </w:r>
+      <w:r>
+        <w:t>here I come!!</w:t>
+      </w:r>
+    </w:p>
+    <w:p>
+      <w:pPr>
+        <w:jc w:val="left"/>
+      </w:pPr>
+      <w:r>
         <w:br w:type="page"/>
       </w:r>
     </w:p>
+    <w:p>
+      <w:pPr>
+        <w:pStyle w:val="Ttulo1"/>
+      </w:pPr>
+      <w:bookmarkStart w:id="2" w:name="_Toc224345059"/>
+      <w:r>
+        <w:lastRenderedPageBreak/>
+        <w:t xml:space="preserve">Chapter2: </w:t>
+      </w:r>
+      <w:bookmarkEnd w:id="2"/>
+      <w:r>
+        <w:t>A</w:t>
+      </w:r>
+      <w:r>
+        <w:t xml:space="preserve"> </w:t>
+      </w:r>
+      <w:r>
+        <w:t>T</w:t>
+      </w:r>
+      <w:r>
+        <w:t xml:space="preserve">urbulent </w:t>
+      </w:r>
+      <w:r>
+        <w:t>J</w:t>
+      </w:r>
+      <w:r>
+        <w:t>ourney</w:t>
+      </w:r>
+    </w:p>
     <w:p/>
+    <w:p>
+      <w:r>
+        <w:rPr>
+          <w:rStyle w:val="NomesCarter"/>
+        </w:rPr>
+        <w:t>Lucas</w:t>
+      </w:r>
+      <w:r>
+        <w:t xml:space="preserve"> promptly </w:t>
+      </w:r>
+      <w:r>
+        <w:t xml:space="preserve">gets on the </w:t>
+      </w:r>
+      <w:r>
+        <w:t>train</w:t>
+      </w:r>
+      <w:r>
+        <w:t xml:space="preserve">, </w:t>
+      </w:r>
+      <w:r>
+        <w:t>it’s realy</w:t>
+      </w:r>
+      <w:r>
+        <w:t xml:space="preserve"> crowded</w:t>
+      </w:r>
+      <w:r>
+        <w:t xml:space="preserve">, some people are talking obnoxiously loudly, some are clearly nervous and some are sleeping soundly. </w:t>
+      </w:r>
+      <w:r>
+        <w:rPr>
+          <w:rStyle w:val="LocalCarter"/>
+        </w:rPr>
+        <w:t>Pinewood Town</w:t>
+      </w:r>
+      <w:r>
+        <w:rPr>
+          <w:rStyle w:val="LocalCarter"/>
+        </w:rPr>
+        <w:t xml:space="preserve"> </w:t>
+      </w:r>
+      <w:r>
+        <w:t>is</w:t>
+      </w:r>
+      <w:r>
+        <w:t xml:space="preserve"> a small </w:t>
+      </w:r>
+      <w:r>
+        <w:t>town,</w:t>
+      </w:r>
+      <w:r>
+        <w:t xml:space="preserve"> so everyone knew </w:t>
+      </w:r>
+      <w:r>
+        <w:t>each other</w:t>
+      </w:r>
+      <w:r>
+        <w:t xml:space="preserve"> and it was clear to see that most of the people on the train were going to the </w:t>
+      </w:r>
+      <w:r>
+        <w:rPr>
+          <w:b/>
+          <w:bCs/>
+        </w:rPr>
+        <w:t>Academy</w:t>
+      </w:r>
+      <w:r>
+        <w:t>.</w:t>
+      </w:r>
+    </w:p>
+    <w:p>
+      <w:r>
+        <w:rPr>
+          <w:rStyle w:val="NomesCarter"/>
+        </w:rPr>
+        <w:t>???:</w:t>
+      </w:r>
+      <w:r>
+        <w:t xml:space="preserve"> Excuse me, would you be so kind as to give me the priority seat please?</w:t>
+      </w:r>
+    </w:p>
+    <w:p>
+      <w:r>
+        <w:rPr>
+          <w:rStyle w:val="NomesCarter"/>
+          <w:color w:val="EE0000"/>
+        </w:rPr>
+        <w:t>???:</w:t>
+      </w:r>
+      <w:r>
+        <w:rPr>
+          <w:color w:val="EE0000"/>
+        </w:rPr>
+        <w:t xml:space="preserve"> </w:t>
+      </w:r>
+      <w:r>
+        <w:t>Seat somewhere else and don’t bother me!</w:t>
+      </w:r>
+    </w:p>
+    <w:p>
+      <w:r>
+        <w:rPr>
+          <w:rStyle w:val="NomesCarter"/>
+        </w:rPr>
+        <w:t>Lucas</w:t>
+      </w:r>
+      <w:r>
+        <w:t xml:space="preserve"> couldn’t stay quiet witnessing this situation. As he is getting </w:t>
+      </w:r>
+      <w:r>
+        <w:t>up,</w:t>
+      </w:r>
+      <w:r>
+        <w:t xml:space="preserve"> he hears a loud impact noise, he looks back to see the rude man on the ground and a girl his age standing over him next to the old lady that asked for the seat.</w:t>
+      </w:r>
+    </w:p>
+    <w:p>
+      <w:r>
+        <w:rPr>
+          <w:rStyle w:val="NomesCarter"/>
+          <w:color w:val="45B0E1" w:themeColor="accent1" w:themeTint="99"/>
+        </w:rPr>
+        <w:t>???:</w:t>
+      </w:r>
+      <w:r>
+        <w:rPr>
+          <w:color w:val="45B0E1" w:themeColor="accent1" w:themeTint="99"/>
+        </w:rPr>
+        <w:t xml:space="preserve"> </w:t>
+      </w:r>
+      <w:r>
+        <w:t>This Loser… Who does he think he is?</w:t>
+      </w:r>
+    </w:p>
+    <w:p>
+      <w:r>
+        <w:rPr>
+          <w:rStyle w:val="NomesCarter"/>
+        </w:rPr>
+        <w:t>???:</w:t>
+      </w:r>
+      <w:r>
+        <w:t xml:space="preserve"> Thank you dear, you really didn’t have to. What’s your name?</w:t>
+      </w:r>
+    </w:p>
+    <w:p>
+      <w:r>
+        <w:rPr>
+          <w:rStyle w:val="NomesCarter"/>
+          <w:color w:val="45B0E1" w:themeColor="accent1" w:themeTint="99"/>
+        </w:rPr>
+        <w:t>Sofia</w:t>
+      </w:r>
+      <w:r>
+        <w:t xml:space="preserve">: My name is Sofia and it was no </w:t>
+      </w:r>
+      <w:r>
+        <w:t>problem;</w:t>
+      </w:r>
+      <w:r>
+        <w:t xml:space="preserve"> I hate </w:t>
+      </w:r>
+      <w:r>
+        <w:t>people who think they’re better than others.</w:t>
+      </w:r>
+    </w:p>
+    <w:p>
+      <w:r>
+        <w:t xml:space="preserve">Another two man approach </w:t>
+      </w:r>
+      <w:r>
+        <w:rPr>
+          <w:rStyle w:val="NomesCarter"/>
+        </w:rPr>
+        <w:t>Sofia</w:t>
+      </w:r>
+      <w:r>
+        <w:t xml:space="preserve">. Everyone seemed ready to fight, there’s an immense tension in the air, security has been notified but can’t change carriages until the train stops. The train is the newest innovation in </w:t>
+      </w:r>
+      <w:r>
+        <w:rPr>
+          <w:rStyle w:val="LocalCarter"/>
+        </w:rPr>
+        <w:t>Tearoma</w:t>
+      </w:r>
+      <w:r>
+        <w:t xml:space="preserve"> being the only motored </w:t>
+      </w:r>
+      <w:r>
+        <w:t>vehicle</w:t>
+      </w:r>
+      <w:r>
+        <w:t>.</w:t>
+      </w:r>
+    </w:p>
+    <w:p>
+      <w:pPr>
+        <w:rPr>
+          <w:rStyle w:val="ClansCarter"/>
+        </w:rPr>
+      </w:pPr>
+      <w:r>
+        <w:rPr>
+          <w:rStyle w:val="NomesCarter"/>
+          <w:color w:val="EE0000"/>
+        </w:rPr>
+        <w:t>???:</w:t>
+      </w:r>
+      <w:r>
+        <w:rPr>
+          <w:color w:val="EE0000"/>
+        </w:rPr>
+        <w:t xml:space="preserve"> </w:t>
+      </w:r>
+      <w:r>
+        <w:t xml:space="preserve">You’re getting it now! You just hit a </w:t>
+      </w:r>
+      <w:r>
+        <w:rPr>
+          <w:rStyle w:val="ClansCarter"/>
+        </w:rPr>
+        <w:t>Wild Crow</w:t>
+      </w:r>
+      <w:r>
+        <w:rPr>
+          <w:rStyle w:val="ClansCarter"/>
+        </w:rPr>
+        <w:t>.</w:t>
+      </w:r>
+    </w:p>
+    <w:p>
+      <w:r>
+        <w:rPr>
+          <w:rStyle w:val="NomesCarter"/>
+        </w:rPr>
+        <w:t>Sofia</w:t>
+      </w:r>
+      <w:r>
+        <w:t>: Hahaha! Is that supposed to scare me? Don’t make me laugh!</w:t>
+      </w:r>
+    </w:p>
+    <w:p>
+      <w:r>
+        <w:t xml:space="preserve">As </w:t>
+      </w:r>
+      <w:r>
+        <w:rPr>
+          <w:rStyle w:val="NomesCarter"/>
+        </w:rPr>
+        <w:t>Sofia</w:t>
+      </w:r>
+      <w:r>
+        <w:t xml:space="preserve"> was ending the sentence, she got really serious, the hole dynamic changed, the carriage is ghost-silent. If security enters the carriage enters everyone involved in a fight will be thrown out making </w:t>
+      </w:r>
+      <w:r>
+        <w:rPr>
+          <w:rStyle w:val="NomesCarter"/>
+        </w:rPr>
+        <w:t>Lucas</w:t>
+      </w:r>
+      <w:r>
+        <w:t xml:space="preserve"> late and unable to enroll into the </w:t>
+      </w:r>
+      <w:r>
+        <w:rPr>
+          <w:b/>
+          <w:bCs/>
+        </w:rPr>
+        <w:t>Wilds Academy</w:t>
+      </w:r>
+      <w:r>
+        <w:t xml:space="preserve"> this year but if he doesn’t help, </w:t>
+      </w:r>
+      <w:r>
+        <w:rPr>
+          <w:rStyle w:val="NomesCarter"/>
+        </w:rPr>
+        <w:t>Sofia</w:t>
+      </w:r>
+      <w:r>
+        <w:t xml:space="preserve"> and the </w:t>
+      </w:r>
+      <w:r>
+        <w:rPr>
+          <w:b/>
+          <w:bCs/>
+        </w:rPr>
+        <w:t>old lady</w:t>
+      </w:r>
+      <w:r>
+        <w:t xml:space="preserve"> might get hurt, it’s a 2 vs 1 after all!</w:t>
+      </w:r>
+    </w:p>
+    <w:p>
+      <w:r>
+        <w:t xml:space="preserve">Should </w:t>
+      </w:r>
+      <w:r>
+        <w:rPr>
+          <w:rStyle w:val="NomesCarter"/>
+        </w:rPr>
+        <w:t>Lucas</w:t>
+      </w:r>
+      <w:r>
+        <w:t xml:space="preserve"> help </w:t>
+      </w:r>
+      <w:r>
+        <w:rPr>
+          <w:rStyle w:val="NomesCarter"/>
+        </w:rPr>
+        <w:t>Sofia</w:t>
+      </w:r>
+      <w:r>
+        <w:t xml:space="preserve"> fight the 2 </w:t>
+      </w:r>
+      <w:r>
+        <w:rPr>
+          <w:rStyle w:val="ClansCarter"/>
+        </w:rPr>
+        <w:t>Wild Crow</w:t>
+      </w:r>
+      <w:r>
+        <w:rPr>
+          <w:rStyle w:val="ClansCarter"/>
+        </w:rPr>
+        <w:t xml:space="preserve"> </w:t>
+      </w:r>
+      <w:r>
+        <w:t>grunts?</w:t>
+      </w:r>
+    </w:p>
+    <w:p>
+      <w:pPr>
+        <w:jc w:val="left"/>
+      </w:pPr>
+      <w:r>
+        <w:br w:type="page"/>
+      </w:r>
+    </w:p>
+    <w:p>
+      <w:pPr>
+        <w:pStyle w:val="Ttulo2"/>
+      </w:pPr>
+      <w:r>
+        <w:lastRenderedPageBreak/>
+        <w:t>Path1: Help Sofia</w:t>
+      </w:r>
+    </w:p>
+    <w:p/>
+    <w:p>
+      <w:r>
+        <w:rPr>
+          <w:rStyle w:val="NomesCarter"/>
+        </w:rPr>
+        <w:t>Lucas</w:t>
+      </w:r>
+      <w:r>
+        <w:t xml:space="preserve"> jumps in and decides to take on one of the grunts while </w:t>
+      </w:r>
+      <w:r>
+        <w:rPr>
+          <w:rStyle w:val="NomesCarter"/>
+        </w:rPr>
+        <w:t>Sofia</w:t>
+      </w:r>
+      <w:r>
+        <w:t xml:space="preserve"> took care of the other.</w:t>
+      </w:r>
+    </w:p>
+    <w:p>
+      <w:r>
+        <w:t xml:space="preserve">After a brief trade of blows </w:t>
+      </w:r>
+      <w:r>
+        <w:rPr>
+          <w:rStyle w:val="NomesCarter"/>
+        </w:rPr>
+        <w:t>Lucas</w:t>
+      </w:r>
+      <w:r>
+        <w:t xml:space="preserve"> hits the grunts’ liver and jaw making him fall to the ground in pain. He looks at </w:t>
+      </w:r>
+      <w:r>
+        <w:rPr>
+          <w:rStyle w:val="NomesCarter"/>
+        </w:rPr>
+        <w:t>Sofia’s</w:t>
+      </w:r>
+      <w:r>
+        <w:t xml:space="preserve"> fight and Sofia is absolutely destroying the grunt.</w:t>
+      </w:r>
+    </w:p>
+    <w:p>
+      <w:r>
+        <w:rPr>
+          <w:rStyle w:val="NomesCarter"/>
+        </w:rPr>
+        <w:t>Lucas</w:t>
+      </w:r>
+      <w:r>
+        <w:t xml:space="preserve">: </w:t>
+      </w:r>
+      <w:r>
+        <w:t xml:space="preserve">*How is that possible? </w:t>
+      </w:r>
+      <w:r>
+        <w:t>Is she really</w:t>
+      </w:r>
+      <w:r>
+        <w:t xml:space="preserve"> destroying someone twice her size with pure </w:t>
+      </w:r>
+      <w:r>
+        <w:t>strength? How is she doing that? She is kind of amazing…*</w:t>
+      </w:r>
+    </w:p>
+    <w:p>
+      <w:r>
+        <w:t xml:space="preserve">The grunts’ movement snaps </w:t>
+      </w:r>
+      <w:r>
+        <w:rPr>
+          <w:rStyle w:val="NomesCarter"/>
+        </w:rPr>
+        <w:t>Lucas</w:t>
+      </w:r>
+      <w:r>
+        <w:t xml:space="preserve"> back to reality. He knocks him out and </w:t>
+      </w:r>
+      <w:r>
+        <w:rPr>
+          <w:rStyle w:val="NomesCarter"/>
+        </w:rPr>
+        <w:t>Sofia</w:t>
+      </w:r>
+      <w:r>
+        <w:t xml:space="preserve"> does the same. The old lady left the train terrified in the middle of the confrontation and so did a number of people.</w:t>
+      </w:r>
+    </w:p>
+    <w:p>
+      <w:r>
+        <w:rPr>
+          <w:rStyle w:val="NomesCarter"/>
+        </w:rPr>
+        <w:t>Lucas</w:t>
+      </w:r>
+      <w:r>
+        <w:t>: Hey…</w:t>
+      </w:r>
+    </w:p>
+    <w:p>
+      <w:r>
+        <w:rPr>
+          <w:rStyle w:val="NomesCarter"/>
+        </w:rPr>
+        <w:t>Sofia</w:t>
+      </w:r>
+      <w:r>
+        <w:t>: I didn’t ask for your help!!</w:t>
+      </w:r>
+    </w:p>
+    <w:p>
+      <w:r>
+        <w:rPr>
+          <w:rStyle w:val="NomesCarter"/>
+        </w:rPr>
+        <w:t>Lucas</w:t>
+      </w:r>
+      <w:r>
+        <w:t>: You’re welcome! Next time I will let them attach you all they want!</w:t>
+      </w:r>
+    </w:p>
+    <w:p>
+      <w:r>
+        <w:rPr>
+          <w:rStyle w:val="NomesCarter"/>
+        </w:rPr>
+        <w:t>Sofia</w:t>
+      </w:r>
+      <w:r>
+        <w:t>: Hmm! I could take them both on easily anyway.</w:t>
+      </w:r>
+    </w:p>
+    <w:p>
+      <w:r>
+        <w:rPr>
+          <w:rStyle w:val="NomesCarter"/>
+        </w:rPr>
+        <w:t>Lucas</w:t>
+      </w:r>
+      <w:r>
+        <w:t>: *What’s wrong with this girl? She’s not good in the head, I just saved her and she just leaves. *</w:t>
+      </w:r>
+    </w:p>
+    <w:p>
+      <w:r>
+        <w:t xml:space="preserve">The train comes to a stop and it’s the closest stop to the </w:t>
+      </w:r>
+      <w:r>
+        <w:rPr>
+          <w:b/>
+          <w:bCs/>
+        </w:rPr>
+        <w:t>Academy</w:t>
+      </w:r>
+      <w:r>
+        <w:t xml:space="preserve"> so it’s time for </w:t>
+      </w:r>
+      <w:r>
+        <w:rPr>
+          <w:rStyle w:val="NomesCarter"/>
+        </w:rPr>
+        <w:t>Lucas</w:t>
+      </w:r>
+      <w:r>
+        <w:t xml:space="preserve"> to get off. A security guard enters the carriage before </w:t>
+      </w:r>
+      <w:r>
+        <w:rPr>
+          <w:rStyle w:val="NomesCarter"/>
+        </w:rPr>
+        <w:t>Lucas</w:t>
+      </w:r>
+      <w:r>
+        <w:t xml:space="preserve"> or </w:t>
+      </w:r>
+      <w:r>
+        <w:rPr>
+          <w:rStyle w:val="NomesCarter"/>
+        </w:rPr>
+        <w:t>Sofia</w:t>
+      </w:r>
+      <w:r>
+        <w:t xml:space="preserve"> could move.</w:t>
+      </w:r>
+    </w:p>
+    <w:p>
+      <w:r>
+        <w:t xml:space="preserve">Security: Ok who here beat up these two gentlemen? </w:t>
+      </w:r>
+    </w:p>
+    <w:p>
+      <w:r>
+        <w:t xml:space="preserve">No one dared to speak a word because everyone saw how strong and short fused </w:t>
+      </w:r>
+      <w:r>
+        <w:rPr>
+          <w:rStyle w:val="NomesCarter"/>
+        </w:rPr>
+        <w:t>Sofia</w:t>
+      </w:r>
+      <w:r>
+        <w:t xml:space="preserve"> was so they both get out and go on their way to the academy.</w:t>
+      </w:r>
+    </w:p>
     <w:sectPr>
+      <w:footerReference w:type="even" r:id="rId9"/>
+      <w:footerReference w:type="default" r:id="rId10"/>
       <w:pgSz w:w="11906" w:h="16838"/>
       <w:pgMar w:top="1417" w:right="1701" w:bottom="1417" w:left="1701" w:header="708" w:footer="708" w:gutter="0"/>
       <w:cols w:space="708"/>
+      <w:titlePg/>
       <w:docGrid w:linePitch="360"/>
     </w:sectPr>
   </w:body>
@@ -79,9 +1728,6 @@
 <w:endnotes xmlns:wpc="http://schemas.microsoft.com/office/word/2010/wordprocessingCanvas" xmlns:cx="http://schemas.microsoft.com/office/drawing/2014/chartex" xmlns:cx1="http://schemas.microsoft.com/office/drawing/2015/9/8/chartex" xmlns:cx2="http://schemas.microsoft.com/office/drawing/2015/10/21/chartex" xmlns:cx3="http://schemas.microsoft.com/office/drawing/2016/5/9/chartex" xmlns:cx4="http://schemas.microsoft.com/office/drawing/2016/5/10/chartex" xmlns:cx5="http://schemas.microsoft.com/office/drawing/2016/5/11/chartex" xmlns:cx6="http://schemas.microsoft.com/office/drawing/2016/5/12/chartex" xmlns:cx7="http://schemas.microsoft.com/office/drawing/2016/5/13/chartex" xmlns:cx8="http://schemas.microsoft.com/office/drawing/2016/5/14/chartex" xmlns:mc="http://schemas.openxmlformats.org/markup-compatibility/2006" xmlns:aink="http://schemas.microsoft.com/office/drawing/2016/ink" xmlns:am3d="http://schemas.microsoft.com/office/drawing/2017/model3d" xmlns:o="urn:schemas-microsoft-com:office:office" xmlns:oel="http://schemas.microsoft.com/office/2019/extlst" xmlns:r="http://schemas.openxmlformats.org/officeDocument/2006/relationships" xmlns:m="http://schemas.openxmlformats.org/officeDocument/2006/math" xmlns:v="urn:schemas-microsoft-com:vml" xmlns:wp14="http://schemas.microsoft.com/office/word/2010/wordprocessingDrawing" xmlns:wp="http://schemas.openxmlformats.org/drawingml/2006/wordprocessingDrawing" xmlns:w10="urn:schemas-microsoft-com:office:word" xmlns:w="http://schemas.openxmlformats.org/wordprocessingml/2006/main" xmlns:w14="http://schemas.microsoft.com/office/word/2010/wordml" xmlns:w15="http://schemas.microsoft.com/office/word/2012/wordml" xmlns:w16cex="http://schemas.microsoft.com/office/word/2018/wordml/cex" xmlns:w16cid="http://schemas.microsoft.com/office/word/2016/wordml/cid" xmlns:w16="http://schemas.microsoft.com/office/word/2018/wordml" xmlns:w16du="http://schemas.microsoft.com/office/word/2023/wordml/word16du" xmlns:w16sdtdh="http://schemas.microsoft.com/office/word/2020/wordml/sdtdatahash" xmlns:w16sdtfl="http://schemas.microsoft.com/office/word/2024/wordml/sdtformatlock" xmlns:w16se="http://schemas.microsoft.com/office/word/2015/wordml/symex" xmlns:wpg="http://schemas.microsoft.com/office/word/2010/wordprocessingGroup" xmlns:wpi="http://schemas.microsoft.com/office/word/2010/wordprocessingInk" xmlns:wne="http://schemas.microsoft.com/office/word/2006/wordml" xmlns:wps="http://schemas.microsoft.com/office/word/2010/wordprocessingShape" mc:Ignorable="w14 w15 w16se w16cid w16 w16cex w16sdtdh w16sdtfl w16du wp14">
   <w:endnote w:type="separator" w:id="-1">
     <w:p>
-      <w:pPr>
-        <w:spacing w:after="0" w:line="240" w:lineRule="auto"/>
-      </w:pPr>
       <w:r>
         <w:separator/>
       </w:r>
@@ -89,24 +1735,162 @@
   </w:endnote>
   <w:endnote w:type="continuationSeparator" w:id="0">
     <w:p>
-      <w:pPr>
-        <w:spacing w:after="0" w:line="240" w:lineRule="auto"/>
-      </w:pPr>
       <w:r>
         <w:continuationSeparator/>
       </w:r>
     </w:p>
   </w:endnote>
 </w:endnotes>
+</file>
+
+<file path=word/footer1.xml><?xml version="1.0" encoding="utf-8"?>
+<w:ftr xmlns:wpc="http://schemas.microsoft.com/office/word/2010/wordprocessingCanvas" xmlns:cx="http://schemas.microsoft.com/office/drawing/2014/chartex" xmlns:cx1="http://schemas.microsoft.com/office/drawing/2015/9/8/chartex" xmlns:cx2="http://schemas.microsoft.com/office/drawing/2015/10/21/chartex" xmlns:cx3="http://schemas.microsoft.com/office/drawing/2016/5/9/chartex" xmlns:cx4="http://schemas.microsoft.com/office/drawing/2016/5/10/chartex" xmlns:cx5="http://schemas.microsoft.com/office/drawing/2016/5/11/chartex" xmlns:cx6="http://schemas.microsoft.com/office/drawing/2016/5/12/chartex" xmlns:cx7="http://schemas.microsoft.com/office/drawing/2016/5/13/chartex" xmlns:cx8="http://schemas.microsoft.com/office/drawing/2016/5/14/chartex" xmlns:mc="http://schemas.openxmlformats.org/markup-compatibility/2006" xmlns:aink="http://schemas.microsoft.com/office/drawing/2016/ink" xmlns:am3d="http://schemas.microsoft.com/office/drawing/2017/model3d" xmlns:o="urn:schemas-microsoft-com:office:office" xmlns:oel="http://schemas.microsoft.com/office/2019/extlst" xmlns:r="http://schemas.openxmlformats.org/officeDocument/2006/relationships" xmlns:m="http://schemas.openxmlformats.org/officeDocument/2006/math" xmlns:v="urn:schemas-microsoft-com:vml" xmlns:wp14="http://schemas.microsoft.com/office/word/2010/wordprocessingDrawing" xmlns:wp="http://schemas.openxmlformats.org/drawingml/2006/wordprocessingDrawing" xmlns:w10="urn:schemas-microsoft-com:office:word" xmlns:w="http://schemas.openxmlformats.org/wordprocessingml/2006/main" xmlns:w14="http://schemas.microsoft.com/office/word/2010/wordml" xmlns:w15="http://schemas.microsoft.com/office/word/2012/wordml" xmlns:w16cex="http://schemas.microsoft.com/office/word/2018/wordml/cex" xmlns:w16cid="http://schemas.microsoft.com/office/word/2016/wordml/cid" xmlns:w16="http://schemas.microsoft.com/office/word/2018/wordml" xmlns:w16du="http://schemas.microsoft.com/office/word/2023/wordml/word16du" xmlns:w16sdtdh="http://schemas.microsoft.com/office/word/2020/wordml/sdtdatahash" xmlns:w16sdtfl="http://schemas.microsoft.com/office/word/2024/wordml/sdtformatlock" xmlns:w16se="http://schemas.microsoft.com/office/word/2015/wordml/symex" xmlns:wpg="http://schemas.microsoft.com/office/word/2010/wordprocessingGroup" xmlns:wpi="http://schemas.microsoft.com/office/word/2010/wordprocessingInk" xmlns:wne="http://schemas.microsoft.com/office/word/2006/wordml" xmlns:wps="http://schemas.microsoft.com/office/word/2010/wordprocessingShape" mc:Ignorable="w14 w15 w16se w16cid w16 w16cex w16sdtdh w16sdtfl w16du wp14">
+  <w:sdt>
+    <w:sdtPr>
+      <w:rPr>
+        <w:rStyle w:val="Nmerodepgina"/>
+      </w:rPr>
+      <w:id w:val="1209985920"/>
+      <w:docPartObj>
+        <w:docPartGallery w:val="Page Numbers (Bottom of Page)"/>
+        <w:docPartUnique/>
+      </w:docPartObj>
+    </w:sdtPr>
+    <w:sdtContent>
+      <w:p>
+        <w:pPr>
+          <w:pStyle w:val="Rodap"/>
+          <w:framePr w:wrap="none" w:vAnchor="text" w:hAnchor="margin" w:xAlign="right" w:y="1"/>
+          <w:rPr>
+            <w:rStyle w:val="Nmerodepgina"/>
+          </w:rPr>
+        </w:pPr>
+        <w:r>
+          <w:rPr>
+            <w:rStyle w:val="Nmerodepgina"/>
+          </w:rPr>
+          <w:fldChar w:fldCharType="begin"/>
+        </w:r>
+        <w:r>
+          <w:rPr>
+            <w:rStyle w:val="Nmerodepgina"/>
+          </w:rPr>
+          <w:instrText xml:space="preserve"> PAGE </w:instrText>
+        </w:r>
+        <w:r>
+          <w:rPr>
+            <w:rStyle w:val="Nmerodepgina"/>
+          </w:rPr>
+          <w:fldChar w:fldCharType="separate"/>
+        </w:r>
+        <w:r>
+          <w:rPr>
+            <w:rStyle w:val="Nmerodepgina"/>
+          </w:rPr>
+          <w:fldChar w:fldCharType="end"/>
+        </w:r>
+      </w:p>
+    </w:sdtContent>
+  </w:sdt>
+  <w:p>
+    <w:pPr>
+      <w:pStyle w:val="Rodap"/>
+      <w:ind w:right="360"/>
+    </w:pPr>
+  </w:p>
+</w:ftr>
+</file>
+
+<file path=word/footer2.xml><?xml version="1.0" encoding="utf-8"?>
+<w:ftr xmlns:wpc="http://schemas.microsoft.com/office/word/2010/wordprocessingCanvas" xmlns:cx="http://schemas.microsoft.com/office/drawing/2014/chartex" xmlns:cx1="http://schemas.microsoft.com/office/drawing/2015/9/8/chartex" xmlns:cx2="http://schemas.microsoft.com/office/drawing/2015/10/21/chartex" xmlns:cx3="http://schemas.microsoft.com/office/drawing/2016/5/9/chartex" xmlns:cx4="http://schemas.microsoft.com/office/drawing/2016/5/10/chartex" xmlns:cx5="http://schemas.microsoft.com/office/drawing/2016/5/11/chartex" xmlns:cx6="http://schemas.microsoft.com/office/drawing/2016/5/12/chartex" xmlns:cx7="http://schemas.microsoft.com/office/drawing/2016/5/13/chartex" xmlns:cx8="http://schemas.microsoft.com/office/drawing/2016/5/14/chartex" xmlns:mc="http://schemas.openxmlformats.org/markup-compatibility/2006" xmlns:aink="http://schemas.microsoft.com/office/drawing/2016/ink" xmlns:am3d="http://schemas.microsoft.com/office/drawing/2017/model3d" xmlns:o="urn:schemas-microsoft-com:office:office" xmlns:oel="http://schemas.microsoft.com/office/2019/extlst" xmlns:r="http://schemas.openxmlformats.org/officeDocument/2006/relationships" xmlns:m="http://schemas.openxmlformats.org/officeDocument/2006/math" xmlns:v="urn:schemas-microsoft-com:vml" xmlns:wp14="http://schemas.microsoft.com/office/word/2010/wordprocessingDrawing" xmlns:wp="http://schemas.openxmlformats.org/drawingml/2006/wordprocessingDrawing" xmlns:w10="urn:schemas-microsoft-com:office:word" xmlns:w="http://schemas.openxmlformats.org/wordprocessingml/2006/main" xmlns:w14="http://schemas.microsoft.com/office/word/2010/wordml" xmlns:w15="http://schemas.microsoft.com/office/word/2012/wordml" xmlns:w16cex="http://schemas.microsoft.com/office/word/2018/wordml/cex" xmlns:w16cid="http://schemas.microsoft.com/office/word/2016/wordml/cid" xmlns:w16="http://schemas.microsoft.com/office/word/2018/wordml" xmlns:w16du="http://schemas.microsoft.com/office/word/2023/wordml/word16du" xmlns:w16sdtdh="http://schemas.microsoft.com/office/word/2020/wordml/sdtdatahash" xmlns:w16sdtfl="http://schemas.microsoft.com/office/word/2024/wordml/sdtformatlock" xmlns:w16se="http://schemas.microsoft.com/office/word/2015/wordml/symex" xmlns:wpg="http://schemas.microsoft.com/office/word/2010/wordprocessingGroup" xmlns:wpi="http://schemas.microsoft.com/office/word/2010/wordprocessingInk" xmlns:wne="http://schemas.microsoft.com/office/word/2006/wordml" xmlns:wps="http://schemas.microsoft.com/office/word/2010/wordprocessingShape" mc:Ignorable="w14 w15 w16se w16cid w16 w16cex w16sdtdh w16sdtfl w16du wp14">
+  <w:sdt>
+    <w:sdtPr>
+      <w:rPr>
+        <w:rStyle w:val="Nmerodepgina"/>
+      </w:rPr>
+      <w:id w:val="2095279621"/>
+      <w:docPartObj>
+        <w:docPartGallery w:val="Page Numbers (Bottom of Page)"/>
+        <w:docPartUnique/>
+      </w:docPartObj>
+    </w:sdtPr>
+    <w:sdtContent>
+      <w:p>
+        <w:pPr>
+          <w:pStyle w:val="Rodap"/>
+          <w:framePr w:wrap="none" w:vAnchor="text" w:hAnchor="margin" w:xAlign="right" w:y="1"/>
+          <w:rPr>
+            <w:rStyle w:val="Nmerodepgina"/>
+          </w:rPr>
+        </w:pPr>
+        <w:r>
+          <w:rPr>
+            <w:rStyle w:val="Nmerodepgina"/>
+          </w:rPr>
+          <w:fldChar w:fldCharType="begin"/>
+        </w:r>
+        <w:r>
+          <w:rPr>
+            <w:rStyle w:val="Nmerodepgina"/>
+          </w:rPr>
+          <w:instrText xml:space="preserve"> PAGE </w:instrText>
+        </w:r>
+        <w:r>
+          <w:rPr>
+            <w:rStyle w:val="Nmerodepgina"/>
+          </w:rPr>
+          <w:fldChar w:fldCharType="separate"/>
+        </w:r>
+        <w:r>
+          <w:rPr>
+            <w:rStyle w:val="Nmerodepgina"/>
+            <w:noProof/>
+          </w:rPr>
+          <w:t>3</w:t>
+        </w:r>
+        <w:r>
+          <w:rPr>
+            <w:rStyle w:val="Nmerodepgina"/>
+          </w:rPr>
+          <w:fldChar w:fldCharType="end"/>
+        </w:r>
+      </w:p>
+    </w:sdtContent>
+  </w:sdt>
+  <w:p>
+    <w:pPr>
+      <w:pStyle w:val="Rodap"/>
+      <w:tabs>
+        <w:tab w:val="clear" w:pos="4252"/>
+        <w:tab w:val="clear" w:pos="8504"/>
+        <w:tab w:val="right" w:pos="8144"/>
+      </w:tabs>
+      <w:ind w:right="360"/>
+      <w:rPr>
+        <w:lang w:val="pt-PT"/>
+      </w:rPr>
+    </w:pPr>
+    <w:r>
+      <w:rPr>
+        <w:lang w:val="pt-PT"/>
+      </w:rPr>
+      <w:t>Martim da Cunha Afonso de Oliveira</w:t>
+    </w:r>
+    <w:r>
+      <w:rPr>
+        <w:lang w:val="pt-PT"/>
+      </w:rPr>
+      <w:tab/>
+      <w:t>--Tearoma--</w:t>
+    </w:r>
+  </w:p>
+</w:ftr>
 </file>
 
 <file path=word/footnotes.xml><?xml version="1.0" encoding="utf-8"?>
 <w:footnotes xmlns:wpc="http://schemas.microsoft.com/office/word/2010/wordprocessingCanvas" xmlns:cx="http://schemas.microsoft.com/office/drawing/2014/chartex" xmlns:cx1="http://schemas.microsoft.com/office/drawing/2015/9/8/chartex" xmlns:cx2="http://schemas.microsoft.com/office/drawing/2015/10/21/chartex" xmlns:cx3="http://schemas.microsoft.com/office/drawing/2016/5/9/chartex" xmlns:cx4="http://schemas.microsoft.com/office/drawing/2016/5/10/chartex" xmlns:cx5="http://schemas.microsoft.com/office/drawing/2016/5/11/chartex" xmlns:cx6="http://schemas.microsoft.com/office/drawing/2016/5/12/chartex" xmlns:cx7="http://schemas.microsoft.com/office/drawing/2016/5/13/chartex" xmlns:cx8="http://schemas.microsoft.com/office/drawing/2016/5/14/chartex" xmlns:mc="http://schemas.openxmlformats.org/markup-compatibility/2006" xmlns:aink="http://schemas.microsoft.com/office/drawing/2016/ink" xmlns:am3d="http://schemas.microsoft.com/office/drawing/2017/model3d" xmlns:o="urn:schemas-microsoft-com:office:office" xmlns:oel="http://schemas.microsoft.com/office/2019/extlst" xmlns:r="http://schemas.openxmlformats.org/officeDocument/2006/relationships" xmlns:m="http://schemas.openxmlformats.org/officeDocument/2006/math" xmlns:v="urn:schemas-microsoft-com:vml" xmlns:wp14="http://schemas.microsoft.com/office/word/2010/wordprocessingDrawing" xmlns:wp="http://schemas.openxmlformats.org/drawingml/2006/wordprocessingDrawing" xmlns:w10="urn:schemas-microsoft-com:office:word" xmlns:w="http://schemas.openxmlformats.org/wordprocessingml/2006/main" xmlns:w14="http://schemas.microsoft.com/office/word/2010/wordml" xmlns:w15="http://schemas.microsoft.com/office/word/2012/wordml" xmlns:w16cex="http://schemas.microsoft.com/office/word/2018/wordml/cex" xmlns:w16cid="http://schemas.microsoft.com/office/word/2016/wordml/cid" xmlns:w16="http://schemas.microsoft.com/office/word/2018/wordml" xmlns:w16du="http://schemas.microsoft.com/office/word/2023/wordml/word16du" xmlns:w16sdtdh="http://schemas.microsoft.com/office/word/2020/wordml/sdtdatahash" xmlns:w16sdtfl="http://schemas.microsoft.com/office/word/2024/wordml/sdtformatlock" xmlns:w16se="http://schemas.microsoft.com/office/word/2015/wordml/symex" xmlns:wpg="http://schemas.microsoft.com/office/word/2010/wordprocessingGroup" xmlns:wpi="http://schemas.microsoft.com/office/word/2010/wordprocessingInk" xmlns:wne="http://schemas.microsoft.com/office/word/2006/wordml" xmlns:wps="http://schemas.microsoft.com/office/word/2010/wordprocessingShape" mc:Ignorable="w14 w15 w16se w16cid w16 w16cex w16sdtdh w16sdtfl w16du wp14">
   <w:footnote w:type="separator" w:id="-1">
     <w:p>
-      <w:pPr>
-        <w:spacing w:after="0" w:line="240" w:lineRule="auto"/>
-      </w:pPr>
       <w:r>
         <w:separator/>
       </w:r>
@@ -114,15 +1898,597 @@
   </w:footnote>
   <w:footnote w:type="continuationSeparator" w:id="0">
     <w:p>
-      <w:pPr>
-        <w:spacing w:after="0" w:line="240" w:lineRule="auto"/>
-      </w:pPr>
       <w:r>
         <w:continuationSeparator/>
       </w:r>
     </w:p>
   </w:footnote>
 </w:footnotes>
+</file>
+
+<file path=word/numbering.xml><?xml version="1.0" encoding="utf-8"?>
+<w:numbering xmlns:wpc="http://schemas.microsoft.com/office/word/2010/wordprocessingCanvas" xmlns:cx="http://schemas.microsoft.com/office/drawing/2014/chartex" xmlns:cx1="http://schemas.microsoft.com/office/drawing/2015/9/8/chartex" xmlns:cx2="http://schemas.microsoft.com/office/drawing/2015/10/21/chartex" xmlns:cx3="http://schemas.microsoft.com/office/drawing/2016/5/9/chartex" xmlns:cx4="http://schemas.microsoft.com/office/drawing/2016/5/10/chartex" xmlns:cx5="http://schemas.microsoft.com/office/drawing/2016/5/11/chartex" xmlns:cx6="http://schemas.microsoft.com/office/drawing/2016/5/12/chartex" xmlns:cx7="http://schemas.microsoft.com/office/drawing/2016/5/13/chartex" xmlns:cx8="http://schemas.microsoft.com/office/drawing/2016/5/14/chartex" xmlns:mc="http://schemas.openxmlformats.org/markup-compatibility/2006" xmlns:aink="http://schemas.microsoft.com/office/drawing/2016/ink" xmlns:am3d="http://schemas.microsoft.com/office/drawing/2017/model3d" xmlns:o="urn:schemas-microsoft-com:office:office" xmlns:oel="http://schemas.microsoft.com/office/2019/extlst" xmlns:r="http://schemas.openxmlformats.org/officeDocument/2006/relationships" xmlns:m="http://schemas.openxmlformats.org/officeDocument/2006/math" xmlns:v="urn:schemas-microsoft-com:vml" xmlns:wp14="http://schemas.microsoft.com/office/word/2010/wordprocessingDrawing" xmlns:wp="http://schemas.openxmlformats.org/drawingml/2006/wordprocessingDrawing" xmlns:w10="urn:schemas-microsoft-com:office:word" xmlns:w="http://schemas.openxmlformats.org/wordprocessingml/2006/main" xmlns:w14="http://schemas.microsoft.com/office/word/2010/wordml" xmlns:w15="http://schemas.microsoft.com/office/word/2012/wordml" xmlns:w16cex="http://schemas.microsoft.com/office/word/2018/wordml/cex" xmlns:w16cid="http://schemas.microsoft.com/office/word/2016/wordml/cid" xmlns:w16="http://schemas.microsoft.com/office/word/2018/wordml" xmlns:w16du="http://schemas.microsoft.com/office/word/2023/wordml/word16du" xmlns:w16sdtdh="http://schemas.microsoft.com/office/word/2020/wordml/sdtdatahash" xmlns:w16sdtfl="http://schemas.microsoft.com/office/word/2024/wordml/sdtformatlock" xmlns:w16se="http://schemas.microsoft.com/office/word/2015/wordml/symex" xmlns:wpg="http://schemas.microsoft.com/office/word/2010/wordprocessingGroup" xmlns:wpi="http://schemas.microsoft.com/office/word/2010/wordprocessingInk" xmlns:wne="http://schemas.microsoft.com/office/word/2006/wordml" xmlns:wps="http://schemas.microsoft.com/office/word/2010/wordprocessingShape" mc:Ignorable="w14 w15 w16se w16cid w16 w16cex w16sdtdh w16sdtfl w16du wp14">
+  <w:abstractNum w:abstractNumId="0" w15:restartNumberingAfterBreak="0">
+    <w:nsid w:val="097E669B"/>
+    <w:multiLevelType w:val="hybridMultilevel"/>
+    <w:tmpl w:val="1B4807EC"/>
+    <w:lvl w:ilvl="0" w:tplc="08160003">
+      <w:start w:val="1"/>
+      <w:numFmt w:val="bullet"/>
+      <w:lvlText w:val="o"/>
+      <w:lvlJc w:val="left"/>
+      <w:pPr>
+        <w:ind w:left="720" w:hanging="360"/>
+      </w:pPr>
+      <w:rPr>
+        <w:rFonts w:ascii="Courier New" w:hAnsi="Courier New" w:cs="Courier New" w:hint="default"/>
+      </w:rPr>
+    </w:lvl>
+    <w:lvl w:ilvl="1" w:tplc="08160003" w:tentative="1">
+      <w:start w:val="1"/>
+      <w:numFmt w:val="bullet"/>
+      <w:lvlText w:val="o"/>
+      <w:lvlJc w:val="left"/>
+      <w:pPr>
+        <w:ind w:left="1440" w:hanging="360"/>
+      </w:pPr>
+      <w:rPr>
+        <w:rFonts w:ascii="Courier New" w:hAnsi="Courier New" w:cs="Courier New" w:hint="default"/>
+      </w:rPr>
+    </w:lvl>
+    <w:lvl w:ilvl="2" w:tplc="08160005" w:tentative="1">
+      <w:start w:val="1"/>
+      <w:numFmt w:val="bullet"/>
+      <w:lvlText w:val=""/>
+      <w:lvlJc w:val="left"/>
+      <w:pPr>
+        <w:ind w:left="2160" w:hanging="360"/>
+      </w:pPr>
+      <w:rPr>
+        <w:rFonts w:ascii="Wingdings" w:hAnsi="Wingdings" w:hint="default"/>
+      </w:rPr>
+    </w:lvl>
+    <w:lvl w:ilvl="3" w:tplc="08160001" w:tentative="1">
+      <w:start w:val="1"/>
+      <w:numFmt w:val="bullet"/>
+      <w:lvlText w:val=""/>
+      <w:lvlJc w:val="left"/>
+      <w:pPr>
+        <w:ind w:left="2880" w:hanging="360"/>
+      </w:pPr>
+      <w:rPr>
+        <w:rFonts w:ascii="Symbol" w:hAnsi="Symbol" w:hint="default"/>
+      </w:rPr>
+    </w:lvl>
+    <w:lvl w:ilvl="4" w:tplc="08160003" w:tentative="1">
+      <w:start w:val="1"/>
+      <w:numFmt w:val="bullet"/>
+      <w:lvlText w:val="o"/>
+      <w:lvlJc w:val="left"/>
+      <w:pPr>
+        <w:ind w:left="3600" w:hanging="360"/>
+      </w:pPr>
+      <w:rPr>
+        <w:rFonts w:ascii="Courier New" w:hAnsi="Courier New" w:cs="Courier New" w:hint="default"/>
+      </w:rPr>
+    </w:lvl>
+    <w:lvl w:ilvl="5" w:tplc="08160005" w:tentative="1">
+      <w:start w:val="1"/>
+      <w:numFmt w:val="bullet"/>
+      <w:lvlText w:val=""/>
+      <w:lvlJc w:val="left"/>
+      <w:pPr>
+        <w:ind w:left="4320" w:hanging="360"/>
+      </w:pPr>
+      <w:rPr>
+        <w:rFonts w:ascii="Wingdings" w:hAnsi="Wingdings" w:hint="default"/>
+      </w:rPr>
+    </w:lvl>
+    <w:lvl w:ilvl="6" w:tplc="08160001" w:tentative="1">
+      <w:start w:val="1"/>
+      <w:numFmt w:val="bullet"/>
+      <w:lvlText w:val=""/>
+      <w:lvlJc w:val="left"/>
+      <w:pPr>
+        <w:ind w:left="5040" w:hanging="360"/>
+      </w:pPr>
+      <w:rPr>
+        <w:rFonts w:ascii="Symbol" w:hAnsi="Symbol" w:hint="default"/>
+      </w:rPr>
+    </w:lvl>
+    <w:lvl w:ilvl="7" w:tplc="08160003" w:tentative="1">
+      <w:start w:val="1"/>
+      <w:numFmt w:val="bullet"/>
+      <w:lvlText w:val="o"/>
+      <w:lvlJc w:val="left"/>
+      <w:pPr>
+        <w:ind w:left="5760" w:hanging="360"/>
+      </w:pPr>
+      <w:rPr>
+        <w:rFonts w:ascii="Courier New" w:hAnsi="Courier New" w:cs="Courier New" w:hint="default"/>
+      </w:rPr>
+    </w:lvl>
+    <w:lvl w:ilvl="8" w:tplc="08160005" w:tentative="1">
+      <w:start w:val="1"/>
+      <w:numFmt w:val="bullet"/>
+      <w:lvlText w:val=""/>
+      <w:lvlJc w:val="left"/>
+      <w:pPr>
+        <w:ind w:left="6480" w:hanging="360"/>
+      </w:pPr>
+      <w:rPr>
+        <w:rFonts w:ascii="Wingdings" w:hAnsi="Wingdings" w:hint="default"/>
+      </w:rPr>
+    </w:lvl>
+  </w:abstractNum>
+  <w:abstractNum w:abstractNumId="1" w15:restartNumberingAfterBreak="0">
+    <w:nsid w:val="331B5E4E"/>
+    <w:multiLevelType w:val="hybridMultilevel"/>
+    <w:tmpl w:val="2A185138"/>
+    <w:lvl w:ilvl="0" w:tplc="08160003">
+      <w:start w:val="1"/>
+      <w:numFmt w:val="bullet"/>
+      <w:lvlText w:val="o"/>
+      <w:lvlJc w:val="left"/>
+      <w:pPr>
+        <w:ind w:left="720" w:hanging="360"/>
+      </w:pPr>
+      <w:rPr>
+        <w:rFonts w:ascii="Courier New" w:hAnsi="Courier New" w:cs="Courier New" w:hint="default"/>
+      </w:rPr>
+    </w:lvl>
+    <w:lvl w:ilvl="1" w:tplc="08160003" w:tentative="1">
+      <w:start w:val="1"/>
+      <w:numFmt w:val="bullet"/>
+      <w:lvlText w:val="o"/>
+      <w:lvlJc w:val="left"/>
+      <w:pPr>
+        <w:ind w:left="1440" w:hanging="360"/>
+      </w:pPr>
+      <w:rPr>
+        <w:rFonts w:ascii="Courier New" w:hAnsi="Courier New" w:cs="Courier New" w:hint="default"/>
+      </w:rPr>
+    </w:lvl>
+    <w:lvl w:ilvl="2" w:tplc="08160005" w:tentative="1">
+      <w:start w:val="1"/>
+      <w:numFmt w:val="bullet"/>
+      <w:lvlText w:val=""/>
+      <w:lvlJc w:val="left"/>
+      <w:pPr>
+        <w:ind w:left="2160" w:hanging="360"/>
+      </w:pPr>
+      <w:rPr>
+        <w:rFonts w:ascii="Wingdings" w:hAnsi="Wingdings" w:hint="default"/>
+      </w:rPr>
+    </w:lvl>
+    <w:lvl w:ilvl="3" w:tplc="08160001" w:tentative="1">
+      <w:start w:val="1"/>
+      <w:numFmt w:val="bullet"/>
+      <w:lvlText w:val=""/>
+      <w:lvlJc w:val="left"/>
+      <w:pPr>
+        <w:ind w:left="2880" w:hanging="360"/>
+      </w:pPr>
+      <w:rPr>
+        <w:rFonts w:ascii="Symbol" w:hAnsi="Symbol" w:hint="default"/>
+      </w:rPr>
+    </w:lvl>
+    <w:lvl w:ilvl="4" w:tplc="08160003" w:tentative="1">
+      <w:start w:val="1"/>
+      <w:numFmt w:val="bullet"/>
+      <w:lvlText w:val="o"/>
+      <w:lvlJc w:val="left"/>
+      <w:pPr>
+        <w:ind w:left="3600" w:hanging="360"/>
+      </w:pPr>
+      <w:rPr>
+        <w:rFonts w:ascii="Courier New" w:hAnsi="Courier New" w:cs="Courier New" w:hint="default"/>
+      </w:rPr>
+    </w:lvl>
+    <w:lvl w:ilvl="5" w:tplc="08160005" w:tentative="1">
+      <w:start w:val="1"/>
+      <w:numFmt w:val="bullet"/>
+      <w:lvlText w:val=""/>
+      <w:lvlJc w:val="left"/>
+      <w:pPr>
+        <w:ind w:left="4320" w:hanging="360"/>
+      </w:pPr>
+      <w:rPr>
+        <w:rFonts w:ascii="Wingdings" w:hAnsi="Wingdings" w:hint="default"/>
+      </w:rPr>
+    </w:lvl>
+    <w:lvl w:ilvl="6" w:tplc="08160001" w:tentative="1">
+      <w:start w:val="1"/>
+      <w:numFmt w:val="bullet"/>
+      <w:lvlText w:val=""/>
+      <w:lvlJc w:val="left"/>
+      <w:pPr>
+        <w:ind w:left="5040" w:hanging="360"/>
+      </w:pPr>
+      <w:rPr>
+        <w:rFonts w:ascii="Symbol" w:hAnsi="Symbol" w:hint="default"/>
+      </w:rPr>
+    </w:lvl>
+    <w:lvl w:ilvl="7" w:tplc="08160003" w:tentative="1">
+      <w:start w:val="1"/>
+      <w:numFmt w:val="bullet"/>
+      <w:lvlText w:val="o"/>
+      <w:lvlJc w:val="left"/>
+      <w:pPr>
+        <w:ind w:left="5760" w:hanging="360"/>
+      </w:pPr>
+      <w:rPr>
+        <w:rFonts w:ascii="Courier New" w:hAnsi="Courier New" w:cs="Courier New" w:hint="default"/>
+      </w:rPr>
+    </w:lvl>
+    <w:lvl w:ilvl="8" w:tplc="08160005" w:tentative="1">
+      <w:start w:val="1"/>
+      <w:numFmt w:val="bullet"/>
+      <w:lvlText w:val=""/>
+      <w:lvlJc w:val="left"/>
+      <w:pPr>
+        <w:ind w:left="6480" w:hanging="360"/>
+      </w:pPr>
+      <w:rPr>
+        <w:rFonts w:ascii="Wingdings" w:hAnsi="Wingdings" w:hint="default"/>
+      </w:rPr>
+    </w:lvl>
+  </w:abstractNum>
+  <w:abstractNum w:abstractNumId="2" w15:restartNumberingAfterBreak="0">
+    <w:nsid w:val="352E6AFD"/>
+    <w:multiLevelType w:val="hybridMultilevel"/>
+    <w:tmpl w:val="7ADA7892"/>
+    <w:lvl w:ilvl="0" w:tplc="08160003">
+      <w:start w:val="1"/>
+      <w:numFmt w:val="bullet"/>
+      <w:lvlText w:val="o"/>
+      <w:lvlJc w:val="left"/>
+      <w:pPr>
+        <w:ind w:left="720" w:hanging="360"/>
+      </w:pPr>
+      <w:rPr>
+        <w:rFonts w:ascii="Courier New" w:hAnsi="Courier New" w:cs="Courier New" w:hint="default"/>
+      </w:rPr>
+    </w:lvl>
+    <w:lvl w:ilvl="1" w:tplc="08160003" w:tentative="1">
+      <w:start w:val="1"/>
+      <w:numFmt w:val="bullet"/>
+      <w:lvlText w:val="o"/>
+      <w:lvlJc w:val="left"/>
+      <w:pPr>
+        <w:ind w:left="1440" w:hanging="360"/>
+      </w:pPr>
+      <w:rPr>
+        <w:rFonts w:ascii="Courier New" w:hAnsi="Courier New" w:cs="Courier New" w:hint="default"/>
+      </w:rPr>
+    </w:lvl>
+    <w:lvl w:ilvl="2" w:tplc="08160005" w:tentative="1">
+      <w:start w:val="1"/>
+      <w:numFmt w:val="bullet"/>
+      <w:lvlText w:val=""/>
+      <w:lvlJc w:val="left"/>
+      <w:pPr>
+        <w:ind w:left="2160" w:hanging="360"/>
+      </w:pPr>
+      <w:rPr>
+        <w:rFonts w:ascii="Wingdings" w:hAnsi="Wingdings" w:hint="default"/>
+      </w:rPr>
+    </w:lvl>
+    <w:lvl w:ilvl="3" w:tplc="08160001" w:tentative="1">
+      <w:start w:val="1"/>
+      <w:numFmt w:val="bullet"/>
+      <w:lvlText w:val=""/>
+      <w:lvlJc w:val="left"/>
+      <w:pPr>
+        <w:ind w:left="2880" w:hanging="360"/>
+      </w:pPr>
+      <w:rPr>
+        <w:rFonts w:ascii="Symbol" w:hAnsi="Symbol" w:hint="default"/>
+      </w:rPr>
+    </w:lvl>
+    <w:lvl w:ilvl="4" w:tplc="08160003" w:tentative="1">
+      <w:start w:val="1"/>
+      <w:numFmt w:val="bullet"/>
+      <w:lvlText w:val="o"/>
+      <w:lvlJc w:val="left"/>
+      <w:pPr>
+        <w:ind w:left="3600" w:hanging="360"/>
+      </w:pPr>
+      <w:rPr>
+        <w:rFonts w:ascii="Courier New" w:hAnsi="Courier New" w:cs="Courier New" w:hint="default"/>
+      </w:rPr>
+    </w:lvl>
+    <w:lvl w:ilvl="5" w:tplc="08160005" w:tentative="1">
+      <w:start w:val="1"/>
+      <w:numFmt w:val="bullet"/>
+      <w:lvlText w:val=""/>
+      <w:lvlJc w:val="left"/>
+      <w:pPr>
+        <w:ind w:left="4320" w:hanging="360"/>
+      </w:pPr>
+      <w:rPr>
+        <w:rFonts w:ascii="Wingdings" w:hAnsi="Wingdings" w:hint="default"/>
+      </w:rPr>
+    </w:lvl>
+    <w:lvl w:ilvl="6" w:tplc="08160001" w:tentative="1">
+      <w:start w:val="1"/>
+      <w:numFmt w:val="bullet"/>
+      <w:lvlText w:val=""/>
+      <w:lvlJc w:val="left"/>
+      <w:pPr>
+        <w:ind w:left="5040" w:hanging="360"/>
+      </w:pPr>
+      <w:rPr>
+        <w:rFonts w:ascii="Symbol" w:hAnsi="Symbol" w:hint="default"/>
+      </w:rPr>
+    </w:lvl>
+    <w:lvl w:ilvl="7" w:tplc="08160003" w:tentative="1">
+      <w:start w:val="1"/>
+      <w:numFmt w:val="bullet"/>
+      <w:lvlText w:val="o"/>
+      <w:lvlJc w:val="left"/>
+      <w:pPr>
+        <w:ind w:left="5760" w:hanging="360"/>
+      </w:pPr>
+      <w:rPr>
+        <w:rFonts w:ascii="Courier New" w:hAnsi="Courier New" w:cs="Courier New" w:hint="default"/>
+      </w:rPr>
+    </w:lvl>
+    <w:lvl w:ilvl="8" w:tplc="08160005" w:tentative="1">
+      <w:start w:val="1"/>
+      <w:numFmt w:val="bullet"/>
+      <w:lvlText w:val=""/>
+      <w:lvlJc w:val="left"/>
+      <w:pPr>
+        <w:ind w:left="6480" w:hanging="360"/>
+      </w:pPr>
+      <w:rPr>
+        <w:rFonts w:ascii="Wingdings" w:hAnsi="Wingdings" w:hint="default"/>
+      </w:rPr>
+    </w:lvl>
+  </w:abstractNum>
+  <w:abstractNum w:abstractNumId="3" w15:restartNumberingAfterBreak="0">
+    <w:nsid w:val="3EE3495D"/>
+    <w:multiLevelType w:val="hybridMultilevel"/>
+    <w:tmpl w:val="51208EAA"/>
+    <w:lvl w:ilvl="0" w:tplc="08160001">
+      <w:start w:val="1"/>
+      <w:numFmt w:val="bullet"/>
+      <w:lvlText w:val=""/>
+      <w:lvlJc w:val="left"/>
+      <w:pPr>
+        <w:ind w:left="720" w:hanging="360"/>
+      </w:pPr>
+      <w:rPr>
+        <w:rFonts w:ascii="Symbol" w:hAnsi="Symbol" w:hint="default"/>
+      </w:rPr>
+    </w:lvl>
+    <w:lvl w:ilvl="1" w:tplc="08160003" w:tentative="1">
+      <w:start w:val="1"/>
+      <w:numFmt w:val="bullet"/>
+      <w:lvlText w:val="o"/>
+      <w:lvlJc w:val="left"/>
+      <w:pPr>
+        <w:ind w:left="1440" w:hanging="360"/>
+      </w:pPr>
+      <w:rPr>
+        <w:rFonts w:ascii="Courier New" w:hAnsi="Courier New" w:cs="Courier New" w:hint="default"/>
+      </w:rPr>
+    </w:lvl>
+    <w:lvl w:ilvl="2" w:tplc="08160005" w:tentative="1">
+      <w:start w:val="1"/>
+      <w:numFmt w:val="bullet"/>
+      <w:lvlText w:val=""/>
+      <w:lvlJc w:val="left"/>
+      <w:pPr>
+        <w:ind w:left="2160" w:hanging="360"/>
+      </w:pPr>
+      <w:rPr>
+        <w:rFonts w:ascii="Wingdings" w:hAnsi="Wingdings" w:hint="default"/>
+      </w:rPr>
+    </w:lvl>
+    <w:lvl w:ilvl="3" w:tplc="08160001" w:tentative="1">
+      <w:start w:val="1"/>
+      <w:numFmt w:val="bullet"/>
+      <w:lvlText w:val=""/>
+      <w:lvlJc w:val="left"/>
+      <w:pPr>
+        <w:ind w:left="2880" w:hanging="360"/>
+      </w:pPr>
+      <w:rPr>
+        <w:rFonts w:ascii="Symbol" w:hAnsi="Symbol" w:hint="default"/>
+      </w:rPr>
+    </w:lvl>
+    <w:lvl w:ilvl="4" w:tplc="08160003" w:tentative="1">
+      <w:start w:val="1"/>
+      <w:numFmt w:val="bullet"/>
+      <w:lvlText w:val="o"/>
+      <w:lvlJc w:val="left"/>
+      <w:pPr>
+        <w:ind w:left="3600" w:hanging="360"/>
+      </w:pPr>
+      <w:rPr>
+        <w:rFonts w:ascii="Courier New" w:hAnsi="Courier New" w:cs="Courier New" w:hint="default"/>
+      </w:rPr>
+    </w:lvl>
+    <w:lvl w:ilvl="5" w:tplc="08160005" w:tentative="1">
+      <w:start w:val="1"/>
+      <w:numFmt w:val="bullet"/>
+      <w:lvlText w:val=""/>
+      <w:lvlJc w:val="left"/>
+      <w:pPr>
+        <w:ind w:left="4320" w:hanging="360"/>
+      </w:pPr>
+      <w:rPr>
+        <w:rFonts w:ascii="Wingdings" w:hAnsi="Wingdings" w:hint="default"/>
+      </w:rPr>
+    </w:lvl>
+    <w:lvl w:ilvl="6" w:tplc="08160001" w:tentative="1">
+      <w:start w:val="1"/>
+      <w:numFmt w:val="bullet"/>
+      <w:lvlText w:val=""/>
+      <w:lvlJc w:val="left"/>
+      <w:pPr>
+        <w:ind w:left="5040" w:hanging="360"/>
+      </w:pPr>
+      <w:rPr>
+        <w:rFonts w:ascii="Symbol" w:hAnsi="Symbol" w:hint="default"/>
+      </w:rPr>
+    </w:lvl>
+    <w:lvl w:ilvl="7" w:tplc="08160003" w:tentative="1">
+      <w:start w:val="1"/>
+      <w:numFmt w:val="bullet"/>
+      <w:lvlText w:val="o"/>
+      <w:lvlJc w:val="left"/>
+      <w:pPr>
+        <w:ind w:left="5760" w:hanging="360"/>
+      </w:pPr>
+      <w:rPr>
+        <w:rFonts w:ascii="Courier New" w:hAnsi="Courier New" w:cs="Courier New" w:hint="default"/>
+      </w:rPr>
+    </w:lvl>
+    <w:lvl w:ilvl="8" w:tplc="08160005" w:tentative="1">
+      <w:start w:val="1"/>
+      <w:numFmt w:val="bullet"/>
+      <w:lvlText w:val=""/>
+      <w:lvlJc w:val="left"/>
+      <w:pPr>
+        <w:ind w:left="6480" w:hanging="360"/>
+      </w:pPr>
+      <w:rPr>
+        <w:rFonts w:ascii="Wingdings" w:hAnsi="Wingdings" w:hint="default"/>
+      </w:rPr>
+    </w:lvl>
+  </w:abstractNum>
+  <w:abstractNum w:abstractNumId="4" w15:restartNumberingAfterBreak="0">
+    <w:nsid w:val="729C1F57"/>
+    <w:multiLevelType w:val="hybridMultilevel"/>
+    <w:tmpl w:val="1010A394"/>
+    <w:lvl w:ilvl="0" w:tplc="08160003">
+      <w:start w:val="1"/>
+      <w:numFmt w:val="bullet"/>
+      <w:lvlText w:val="o"/>
+      <w:lvlJc w:val="left"/>
+      <w:pPr>
+        <w:ind w:left="720" w:hanging="360"/>
+      </w:pPr>
+      <w:rPr>
+        <w:rFonts w:ascii="Courier New" w:hAnsi="Courier New" w:cs="Courier New" w:hint="default"/>
+      </w:rPr>
+    </w:lvl>
+    <w:lvl w:ilvl="1" w:tplc="08160003" w:tentative="1">
+      <w:start w:val="1"/>
+      <w:numFmt w:val="bullet"/>
+      <w:lvlText w:val="o"/>
+      <w:lvlJc w:val="left"/>
+      <w:pPr>
+        <w:ind w:left="1440" w:hanging="360"/>
+      </w:pPr>
+      <w:rPr>
+        <w:rFonts w:ascii="Courier New" w:hAnsi="Courier New" w:cs="Courier New" w:hint="default"/>
+      </w:rPr>
+    </w:lvl>
+    <w:lvl w:ilvl="2" w:tplc="08160005" w:tentative="1">
+      <w:start w:val="1"/>
+      <w:numFmt w:val="bullet"/>
+      <w:lvlText w:val=""/>
+      <w:lvlJc w:val="left"/>
+      <w:pPr>
+        <w:ind w:left="2160" w:hanging="360"/>
+      </w:pPr>
+      <w:rPr>
+        <w:rFonts w:ascii="Wingdings" w:hAnsi="Wingdings" w:hint="default"/>
+      </w:rPr>
+    </w:lvl>
+    <w:lvl w:ilvl="3" w:tplc="08160001" w:tentative="1">
+      <w:start w:val="1"/>
+      <w:numFmt w:val="bullet"/>
+      <w:lvlText w:val=""/>
+      <w:lvlJc w:val="left"/>
+      <w:pPr>
+        <w:ind w:left="2880" w:hanging="360"/>
+      </w:pPr>
+      <w:rPr>
+        <w:rFonts w:ascii="Symbol" w:hAnsi="Symbol" w:hint="default"/>
+      </w:rPr>
+    </w:lvl>
+    <w:lvl w:ilvl="4" w:tplc="08160003" w:tentative="1">
+      <w:start w:val="1"/>
+      <w:numFmt w:val="bullet"/>
+      <w:lvlText w:val="o"/>
+      <w:lvlJc w:val="left"/>
+      <w:pPr>
+        <w:ind w:left="3600" w:hanging="360"/>
+      </w:pPr>
+      <w:rPr>
+        <w:rFonts w:ascii="Courier New" w:hAnsi="Courier New" w:cs="Courier New" w:hint="default"/>
+      </w:rPr>
+    </w:lvl>
+    <w:lvl w:ilvl="5" w:tplc="08160005" w:tentative="1">
+      <w:start w:val="1"/>
+      <w:numFmt w:val="bullet"/>
+      <w:lvlText w:val=""/>
+      <w:lvlJc w:val="left"/>
+      <w:pPr>
+        <w:ind w:left="4320" w:hanging="360"/>
+      </w:pPr>
+      <w:rPr>
+        <w:rFonts w:ascii="Wingdings" w:hAnsi="Wingdings" w:hint="default"/>
+      </w:rPr>
+    </w:lvl>
+    <w:lvl w:ilvl="6" w:tplc="08160001" w:tentative="1">
+      <w:start w:val="1"/>
+      <w:numFmt w:val="bullet"/>
+      <w:lvlText w:val=""/>
+      <w:lvlJc w:val="left"/>
+      <w:pPr>
+        <w:ind w:left="5040" w:hanging="360"/>
+      </w:pPr>
+      <w:rPr>
+        <w:rFonts w:ascii="Symbol" w:hAnsi="Symbol" w:hint="default"/>
+      </w:rPr>
+    </w:lvl>
+    <w:lvl w:ilvl="7" w:tplc="08160003" w:tentative="1">
+      <w:start w:val="1"/>
+      <w:numFmt w:val="bullet"/>
+      <w:lvlText w:val="o"/>
+      <w:lvlJc w:val="left"/>
+      <w:pPr>
+        <w:ind w:left="5760" w:hanging="360"/>
+      </w:pPr>
+      <w:rPr>
+        <w:rFonts w:ascii="Courier New" w:hAnsi="Courier New" w:cs="Courier New" w:hint="default"/>
+      </w:rPr>
+    </w:lvl>
+    <w:lvl w:ilvl="8" w:tplc="08160005" w:tentative="1">
+      <w:start w:val="1"/>
+      <w:numFmt w:val="bullet"/>
+      <w:lvlText w:val=""/>
+      <w:lvlJc w:val="left"/>
+      <w:pPr>
+        <w:ind w:left="6480" w:hanging="360"/>
+      </w:pPr>
+      <w:rPr>
+        <w:rFonts w:ascii="Wingdings" w:hAnsi="Wingdings" w:hint="default"/>
+      </w:rPr>
+    </w:lvl>
+  </w:abstractNum>
+  <w:num w:numId="1" w16cid:durableId="2003120806">
+    <w:abstractNumId w:val="3"/>
+  </w:num>
+  <w:num w:numId="2" w16cid:durableId="1258557762">
+    <w:abstractNumId w:val="1"/>
+  </w:num>
+  <w:num w:numId="3" w16cid:durableId="792286597">
+    <w:abstractNumId w:val="0"/>
+  </w:num>
+  <w:num w:numId="4" w16cid:durableId="1159930105">
+    <w:abstractNumId w:val="2"/>
+  </w:num>
+  <w:num w:numId="5" w16cid:durableId="58289882">
+    <w:abstractNumId w:val="4"/>
+  </w:num>
+</w:numbering>
 </file>
 
 <file path=word/styles.xml><?xml version="1.0" encoding="utf-8"?>
@@ -302,7 +2668,7 @@
     <w:lsdException w:name="Table Grid" w:uiPriority="39"/>
     <w:lsdException w:name="Table Theme" w:semiHidden="1" w:unhideWhenUsed="1"/>
     <w:lsdException w:name="Placeholder Text" w:semiHidden="1"/>
-    <w:lsdException w:name="No Spacing" w:uiPriority="1" w:qFormat="1"/>
+    <w:lsdException w:name="No Spacing" w:uiPriority="1"/>
     <w:lsdException w:name="Light Shading" w:uiPriority="60"/>
     <w:lsdException w:name="Light List" w:uiPriority="61"/>
     <w:lsdException w:name="Light Grid" w:uiPriority="62"/>
@@ -525,6 +2891,14 @@
   <w:style w:type="paragraph" w:default="1" w:styleId="Normal">
     <w:name w:val="Normal"/>
     <w:qFormat/>
+    <w:rsid w:val="00835A3D"/>
+    <w:pPr>
+      <w:jc w:val="both"/>
+    </w:pPr>
+    <w:rPr>
+      <w:rFonts w:ascii="Source Sans Pro" w:hAnsi="Source Sans Pro"/>
+      <w:lang w:val="en-US"/>
+    </w:rPr>
   </w:style>
   <w:style w:type="paragraph" w:styleId="Ttulo1">
     <w:name w:val="heading 1"/>
@@ -533,7 +2907,7 @@
     <w:link w:val="Ttulo1Carter"/>
     <w:uiPriority w:val="9"/>
     <w:qFormat/>
-    <w:rsid w:val="00900455"/>
+    <w:rsid w:val="00835A3D"/>
     <w:pPr>
       <w:keepNext/>
       <w:keepLines/>
@@ -541,8 +2915,10 @@
       <w:outlineLvl w:val="0"/>
     </w:pPr>
     <w:rPr>
-      <w:rFonts w:asciiTheme="majorHAnsi" w:eastAsiaTheme="majorEastAsia" w:hAnsiTheme="majorHAnsi" w:cstheme="majorBidi"/>
-      <w:color w:val="0F4761" w:themeColor="accent1" w:themeShade="BF"/>
+      <w:rFonts w:eastAsiaTheme="majorEastAsia" w:cstheme="majorBidi"/>
+      <w:b/>
+      <w:bCs/>
+      <w:color w:val="000000" w:themeColor="text1"/>
       <w:sz w:val="40"/>
       <w:szCs w:val="40"/>
     </w:rPr>
@@ -553,7 +2929,6 @@
     <w:next w:val="Normal"/>
     <w:link w:val="Ttulo2Carter"/>
     <w:uiPriority w:val="9"/>
-    <w:semiHidden/>
     <w:unhideWhenUsed/>
     <w:qFormat/>
     <w:rsid w:val="00900455"/>
@@ -756,10 +3131,12 @@
     <w:basedOn w:val="Tipodeletrapredefinidodopargrafo"/>
     <w:link w:val="Ttulo1"/>
     <w:uiPriority w:val="9"/>
-    <w:rsid w:val="00900455"/>
-    <w:rPr>
-      <w:rFonts w:asciiTheme="majorHAnsi" w:eastAsiaTheme="majorEastAsia" w:hAnsiTheme="majorHAnsi" w:cstheme="majorBidi"/>
-      <w:color w:val="0F4761" w:themeColor="accent1" w:themeShade="BF"/>
+    <w:rsid w:val="00835A3D"/>
+    <w:rPr>
+      <w:rFonts w:ascii="Source Sans Pro" w:eastAsiaTheme="majorEastAsia" w:hAnsi="Source Sans Pro" w:cstheme="majorBidi"/>
+      <w:b/>
+      <w:bCs/>
+      <w:color w:val="000000" w:themeColor="text1"/>
       <w:sz w:val="40"/>
       <w:szCs w:val="40"/>
     </w:rPr>
@@ -769,7 +3146,6 @@
     <w:basedOn w:val="Tipodeletrapredefinidodopargrafo"/>
     <w:link w:val="Ttulo2"/>
     <w:uiPriority w:val="9"/>
-    <w:semiHidden/>
     <w:rsid w:val="00900455"/>
     <w:rPr>
       <w:rFonts w:asciiTheme="majorHAnsi" w:eastAsiaTheme="majorEastAsia" w:hAnsiTheme="majorHAnsi" w:cstheme="majorBidi"/>
@@ -1084,6 +3460,328 @@
     <w:link w:val="Rodap"/>
     <w:uiPriority w:val="99"/>
     <w:rsid w:val="00900455"/>
+  </w:style>
+  <w:style w:type="paragraph" w:styleId="Cabealhodondice">
+    <w:name w:val="TOC Heading"/>
+    <w:basedOn w:val="Normal"/>
+    <w:next w:val="Normal"/>
+    <w:uiPriority w:val="39"/>
+    <w:unhideWhenUsed/>
+    <w:qFormat/>
+    <w:rsid w:val="00E436AD"/>
+    <w:pPr>
+      <w:keepNext/>
+      <w:keepLines/>
+      <w:spacing w:before="480" w:after="0" w:line="276" w:lineRule="auto"/>
+      <w:jc w:val="left"/>
+    </w:pPr>
+    <w:rPr>
+      <w:rFonts w:asciiTheme="majorHAnsi" w:eastAsiaTheme="majorEastAsia" w:hAnsiTheme="majorHAnsi" w:cstheme="majorBidi"/>
+      <w:b/>
+      <w:bCs/>
+      <w:color w:val="0F4761" w:themeColor="accent1" w:themeShade="BF"/>
+      <w:kern w:val="0"/>
+      <w:sz w:val="28"/>
+      <w:szCs w:val="28"/>
+      <w:lang w:val="pt-PT" w:eastAsia="pt-PT"/>
+      <w14:ligatures w14:val="none"/>
+    </w:rPr>
+  </w:style>
+  <w:style w:type="paragraph" w:styleId="ndice1">
+    <w:name w:val="toc 1"/>
+    <w:basedOn w:val="Normal"/>
+    <w:next w:val="Normal"/>
+    <w:autoRedefine/>
+    <w:uiPriority w:val="39"/>
+    <w:unhideWhenUsed/>
+    <w:rsid w:val="00E436AD"/>
+    <w:pPr>
+      <w:spacing w:before="120" w:after="0"/>
+      <w:jc w:val="left"/>
+    </w:pPr>
+    <w:rPr>
+      <w:rFonts w:asciiTheme="minorHAnsi" w:hAnsiTheme="minorHAnsi"/>
+      <w:b/>
+      <w:bCs/>
+      <w:i/>
+      <w:iCs/>
+    </w:rPr>
+  </w:style>
+  <w:style w:type="character" w:styleId="Hiperligao">
+    <w:name w:val="Hyperlink"/>
+    <w:basedOn w:val="Tipodeletrapredefinidodopargrafo"/>
+    <w:uiPriority w:val="99"/>
+    <w:unhideWhenUsed/>
+    <w:rsid w:val="00E436AD"/>
+    <w:rPr>
+      <w:color w:val="467886" w:themeColor="hyperlink"/>
+      <w:u w:val="single"/>
+    </w:rPr>
+  </w:style>
+  <w:style w:type="paragraph" w:styleId="ndice2">
+    <w:name w:val="toc 2"/>
+    <w:basedOn w:val="Normal"/>
+    <w:next w:val="Normal"/>
+    <w:autoRedefine/>
+    <w:uiPriority w:val="39"/>
+    <w:semiHidden/>
+    <w:unhideWhenUsed/>
+    <w:rsid w:val="00E436AD"/>
+    <w:pPr>
+      <w:spacing w:before="120" w:after="0"/>
+      <w:ind w:left="240"/>
+      <w:jc w:val="left"/>
+    </w:pPr>
+    <w:rPr>
+      <w:rFonts w:asciiTheme="minorHAnsi" w:hAnsiTheme="minorHAnsi"/>
+      <w:b/>
+      <w:bCs/>
+      <w:sz w:val="22"/>
+      <w:szCs w:val="22"/>
+    </w:rPr>
+  </w:style>
+  <w:style w:type="paragraph" w:styleId="ndice3">
+    <w:name w:val="toc 3"/>
+    <w:basedOn w:val="Normal"/>
+    <w:next w:val="Normal"/>
+    <w:autoRedefine/>
+    <w:uiPriority w:val="39"/>
+    <w:semiHidden/>
+    <w:unhideWhenUsed/>
+    <w:rsid w:val="00E436AD"/>
+    <w:pPr>
+      <w:spacing w:after="0"/>
+      <w:ind w:left="480"/>
+      <w:jc w:val="left"/>
+    </w:pPr>
+    <w:rPr>
+      <w:rFonts w:asciiTheme="minorHAnsi" w:hAnsiTheme="minorHAnsi"/>
+      <w:sz w:val="20"/>
+      <w:szCs w:val="20"/>
+    </w:rPr>
+  </w:style>
+  <w:style w:type="paragraph" w:styleId="ndice4">
+    <w:name w:val="toc 4"/>
+    <w:basedOn w:val="Normal"/>
+    <w:next w:val="Normal"/>
+    <w:autoRedefine/>
+    <w:uiPriority w:val="39"/>
+    <w:semiHidden/>
+    <w:unhideWhenUsed/>
+    <w:rsid w:val="00E436AD"/>
+    <w:pPr>
+      <w:spacing w:after="0"/>
+      <w:ind w:left="720"/>
+      <w:jc w:val="left"/>
+    </w:pPr>
+    <w:rPr>
+      <w:rFonts w:asciiTheme="minorHAnsi" w:hAnsiTheme="minorHAnsi"/>
+      <w:sz w:val="20"/>
+      <w:szCs w:val="20"/>
+    </w:rPr>
+  </w:style>
+  <w:style w:type="paragraph" w:styleId="ndice5">
+    <w:name w:val="toc 5"/>
+    <w:basedOn w:val="Normal"/>
+    <w:next w:val="Normal"/>
+    <w:autoRedefine/>
+    <w:uiPriority w:val="39"/>
+    <w:semiHidden/>
+    <w:unhideWhenUsed/>
+    <w:rsid w:val="00E436AD"/>
+    <w:pPr>
+      <w:spacing w:after="0"/>
+      <w:ind w:left="960"/>
+      <w:jc w:val="left"/>
+    </w:pPr>
+    <w:rPr>
+      <w:rFonts w:asciiTheme="minorHAnsi" w:hAnsiTheme="minorHAnsi"/>
+      <w:sz w:val="20"/>
+      <w:szCs w:val="20"/>
+    </w:rPr>
+  </w:style>
+  <w:style w:type="paragraph" w:styleId="ndice6">
+    <w:name w:val="toc 6"/>
+    <w:basedOn w:val="Normal"/>
+    <w:next w:val="Normal"/>
+    <w:autoRedefine/>
+    <w:uiPriority w:val="39"/>
+    <w:semiHidden/>
+    <w:unhideWhenUsed/>
+    <w:rsid w:val="00E436AD"/>
+    <w:pPr>
+      <w:spacing w:after="0"/>
+      <w:ind w:left="1200"/>
+      <w:jc w:val="left"/>
+    </w:pPr>
+    <w:rPr>
+      <w:rFonts w:asciiTheme="minorHAnsi" w:hAnsiTheme="minorHAnsi"/>
+      <w:sz w:val="20"/>
+      <w:szCs w:val="20"/>
+    </w:rPr>
+  </w:style>
+  <w:style w:type="paragraph" w:styleId="ndice7">
+    <w:name w:val="toc 7"/>
+    <w:basedOn w:val="Normal"/>
+    <w:next w:val="Normal"/>
+    <w:autoRedefine/>
+    <w:uiPriority w:val="39"/>
+    <w:semiHidden/>
+    <w:unhideWhenUsed/>
+    <w:rsid w:val="00E436AD"/>
+    <w:pPr>
+      <w:spacing w:after="0"/>
+      <w:ind w:left="1440"/>
+      <w:jc w:val="left"/>
+    </w:pPr>
+    <w:rPr>
+      <w:rFonts w:asciiTheme="minorHAnsi" w:hAnsiTheme="minorHAnsi"/>
+      <w:sz w:val="20"/>
+      <w:szCs w:val="20"/>
+    </w:rPr>
+  </w:style>
+  <w:style w:type="paragraph" w:styleId="ndice8">
+    <w:name w:val="toc 8"/>
+    <w:basedOn w:val="Normal"/>
+    <w:next w:val="Normal"/>
+    <w:autoRedefine/>
+    <w:uiPriority w:val="39"/>
+    <w:semiHidden/>
+    <w:unhideWhenUsed/>
+    <w:rsid w:val="00E436AD"/>
+    <w:pPr>
+      <w:spacing w:after="0"/>
+      <w:ind w:left="1680"/>
+      <w:jc w:val="left"/>
+    </w:pPr>
+    <w:rPr>
+      <w:rFonts w:asciiTheme="minorHAnsi" w:hAnsiTheme="minorHAnsi"/>
+      <w:sz w:val="20"/>
+      <w:szCs w:val="20"/>
+    </w:rPr>
+  </w:style>
+  <w:style w:type="paragraph" w:styleId="ndice9">
+    <w:name w:val="toc 9"/>
+    <w:basedOn w:val="Normal"/>
+    <w:next w:val="Normal"/>
+    <w:autoRedefine/>
+    <w:uiPriority w:val="39"/>
+    <w:semiHidden/>
+    <w:unhideWhenUsed/>
+    <w:rsid w:val="00E436AD"/>
+    <w:pPr>
+      <w:spacing w:after="0"/>
+      <w:ind w:left="1920"/>
+      <w:jc w:val="left"/>
+    </w:pPr>
+    <w:rPr>
+      <w:rFonts w:asciiTheme="minorHAnsi" w:hAnsiTheme="minorHAnsi"/>
+      <w:sz w:val="20"/>
+      <w:szCs w:val="20"/>
+    </w:rPr>
+  </w:style>
+  <w:style w:type="character" w:styleId="nfaseDiscreta">
+    <w:name w:val="Subtle Emphasis"/>
+    <w:uiPriority w:val="19"/>
+    <w:qFormat/>
+    <w:rsid w:val="00D955D9"/>
+    <w:rPr>
+      <w:b/>
+      <w:bCs/>
+      <w:color w:val="A02B93" w:themeColor="accent5"/>
+    </w:rPr>
+  </w:style>
+  <w:style w:type="paragraph" w:styleId="SemEspaamento">
+    <w:name w:val="No Spacing"/>
+    <w:basedOn w:val="Normal"/>
+    <w:uiPriority w:val="1"/>
+    <w:rsid w:val="00DF745B"/>
+    <w:rPr>
+      <w:b/>
+      <w:bCs/>
+      <w:color w:val="BF4E14" w:themeColor="accent2" w:themeShade="BF"/>
+    </w:rPr>
+  </w:style>
+  <w:style w:type="paragraph" w:customStyle="1" w:styleId="Local">
+    <w:name w:val="Local"/>
+    <w:basedOn w:val="Normal"/>
+    <w:link w:val="LocalCarter"/>
+    <w:qFormat/>
+    <w:rsid w:val="00DF745B"/>
+    <w:rPr>
+      <w:b/>
+      <w:bCs/>
+      <w:color w:val="BF4E14" w:themeColor="accent2" w:themeShade="BF"/>
+    </w:rPr>
+  </w:style>
+  <w:style w:type="paragraph" w:customStyle="1" w:styleId="Nomes">
+    <w:name w:val="Nomes"/>
+    <w:basedOn w:val="Normal"/>
+    <w:link w:val="NomesCarter"/>
+    <w:qFormat/>
+    <w:rsid w:val="00DF745B"/>
+    <w:rPr>
+      <w:b/>
+      <w:color w:val="A02B93" w:themeColor="accent5"/>
+    </w:rPr>
+  </w:style>
+  <w:style w:type="character" w:customStyle="1" w:styleId="LocalCarter">
+    <w:name w:val="Local Caráter"/>
+    <w:basedOn w:val="Tipodeletrapredefinidodopargrafo"/>
+    <w:link w:val="Local"/>
+    <w:rsid w:val="00DF745B"/>
+    <w:rPr>
+      <w:rFonts w:ascii="Source Sans Pro" w:hAnsi="Source Sans Pro"/>
+      <w:b/>
+      <w:bCs/>
+      <w:color w:val="BF4E14" w:themeColor="accent2" w:themeShade="BF"/>
+      <w:lang w:val="en-US"/>
+    </w:rPr>
+  </w:style>
+  <w:style w:type="character" w:customStyle="1" w:styleId="NomesCarter">
+    <w:name w:val="Nomes Caráter"/>
+    <w:basedOn w:val="Tipodeletrapredefinidodopargrafo"/>
+    <w:link w:val="Nomes"/>
+    <w:rsid w:val="00DF745B"/>
+    <w:rPr>
+      <w:rFonts w:ascii="Source Sans Pro" w:hAnsi="Source Sans Pro"/>
+      <w:b/>
+      <w:color w:val="A02B93" w:themeColor="accent5"/>
+      <w:lang w:val="en-US"/>
+    </w:rPr>
+  </w:style>
+  <w:style w:type="paragraph" w:customStyle="1" w:styleId="Clans">
+    <w:name w:val="Clans"/>
+    <w:basedOn w:val="Normal"/>
+    <w:link w:val="ClansCarter"/>
+    <w:qFormat/>
+    <w:rsid w:val="00DF745B"/>
+    <w:rPr>
+      <w:b/>
+      <w:i/>
+      <w:color w:val="C00000"/>
+    </w:rPr>
+  </w:style>
+  <w:style w:type="character" w:customStyle="1" w:styleId="ClansCarter">
+    <w:name w:val="Clans Caráter"/>
+    <w:basedOn w:val="Tipodeletrapredefinidodopargrafo"/>
+    <w:link w:val="Clans"/>
+    <w:rsid w:val="00DF745B"/>
+    <w:rPr>
+      <w:rFonts w:ascii="Source Sans Pro" w:hAnsi="Source Sans Pro"/>
+      <w:b/>
+      <w:i/>
+      <w:color w:val="C00000"/>
+      <w:lang w:val="en-US"/>
+    </w:rPr>
+  </w:style>
+  <w:style w:type="character" w:styleId="Nmerodepgina">
+    <w:name w:val="page number"/>
+    <w:basedOn w:val="Tipodeletrapredefinidodopargrafo"/>
+    <w:uiPriority w:val="99"/>
+    <w:semiHidden/>
+    <w:unhideWhenUsed/>
+    <w:rsid w:val="00ED43C0"/>
   </w:style>
 </w:styles>
 </file>
@@ -1401,4 +4099,16 @@
     </a:ext>
   </a:extLst>
 </a:theme>
+</file>
+
+<file path=customXml/item1.xml><?xml version="1.0" encoding="utf-8"?>
+<b:Sources xmlns:b="http://schemas.openxmlformats.org/officeDocument/2006/bibliography" xmlns="http://schemas.openxmlformats.org/officeDocument/2006/bibliography" SelectedStyle="/APASixthEditionOfficeOnline.xsl" StyleName="APA" Version="6"/>
+</file>
+
+<file path=customXml/itemProps1.xml><?xml version="1.0" encoding="utf-8"?>
+<ds:datastoreItem xmlns:ds="http://schemas.openxmlformats.org/officeDocument/2006/customXml" ds:itemID="{ADDE47C3-C336-B844-8FB7-DC435C72AD87}">
+  <ds:schemaRefs>
+    <ds:schemaRef ds:uri="http://schemas.openxmlformats.org/officeDocument/2006/bibliography"/>
+  </ds:schemaRefs>
+</ds:datastoreItem>
 </file>
</xml_diff>